<commit_message>
actualizacion BD y plantillas de Gasolinera
</commit_message>
<xml_diff>
--- a/Inputs/Templates/MF Gasolinera.docx
+++ b/Inputs/Templates/MF Gasolinera.docx
@@ -96,11 +96,25 @@
                 <w:rFonts w:ascii="Arial" w:hAnsi="Arial" w:cs="Arial"/>
               </w:rPr>
             </w:pPr>
-            <w:r>
-              <w:rPr>
-                <w:rFonts w:ascii="Arial" w:hAnsi="Arial" w:cs="Arial"/>
-              </w:rPr>
-              <w:t>{{ fachada }}</w:t>
+            <w:proofErr w:type="gramStart"/>
+            <w:r>
+              <w:rPr>
+                <w:rFonts w:ascii="Arial" w:hAnsi="Arial" w:cs="Arial"/>
+              </w:rPr>
+              <w:t>{{ fachada</w:t>
+            </w:r>
+            <w:proofErr w:type="gramEnd"/>
+            <w:r>
+              <w:rPr>
+                <w:rFonts w:ascii="Arial" w:hAnsi="Arial" w:cs="Arial"/>
+              </w:rPr>
+              <w:t>1</w:t>
+            </w:r>
+            <w:r>
+              <w:rPr>
+                <w:rFonts w:ascii="Arial" w:hAnsi="Arial" w:cs="Arial"/>
+              </w:rPr>
+              <w:t xml:space="preserve"> }}</w:t>
             </w:r>
           </w:p>
         </w:tc>
@@ -144,6 +158,7 @@
                 <w:rFonts w:ascii="Arial" w:hAnsi="Arial" w:cs="Arial"/>
               </w:rPr>
             </w:pPr>
+            <w:proofErr w:type="gramStart"/>
             <w:r>
               <w:rPr>
                 <w:rFonts w:ascii="Arial" w:hAnsi="Arial" w:cs="Arial"/>
@@ -154,7 +169,14 @@
               <w:rPr>
                 <w:rFonts w:ascii="Arial" w:hAnsi="Arial" w:cs="Arial"/>
               </w:rPr>
-              <w:t>mueble1</w:t>
+              <w:t>mueble</w:t>
+            </w:r>
+            <w:proofErr w:type="gramEnd"/>
+            <w:r>
+              <w:rPr>
+                <w:rFonts w:ascii="Arial" w:hAnsi="Arial" w:cs="Arial"/>
+              </w:rPr>
+              <w:t>1</w:t>
             </w:r>
             <w:r>
               <w:rPr>
@@ -204,11 +226,19 @@
                 <w:rFonts w:ascii="Arial" w:hAnsi="Arial" w:cs="Arial"/>
               </w:rPr>
             </w:pPr>
-            <w:r>
-              <w:rPr>
-                <w:rFonts w:ascii="Arial" w:hAnsi="Arial" w:cs="Arial"/>
-              </w:rPr>
-              <w:t>{{ ext1 }}</w:t>
+            <w:proofErr w:type="gramStart"/>
+            <w:r>
+              <w:rPr>
+                <w:rFonts w:ascii="Arial" w:hAnsi="Arial" w:cs="Arial"/>
+              </w:rPr>
+              <w:t>{{ ext</w:t>
+            </w:r>
+            <w:proofErr w:type="gramEnd"/>
+            <w:r>
+              <w:rPr>
+                <w:rFonts w:ascii="Arial" w:hAnsi="Arial" w:cs="Arial"/>
+              </w:rPr>
+              <w:t>1 }}</w:t>
             </w:r>
           </w:p>
         </w:tc>
@@ -260,11 +290,19 @@
                 <w:rFonts w:ascii="Arial" w:hAnsi="Arial" w:cs="Arial"/>
               </w:rPr>
             </w:pPr>
-            <w:r>
-              <w:rPr>
-                <w:rFonts w:ascii="Arial" w:hAnsi="Arial" w:cs="Arial"/>
-              </w:rPr>
-              <w:t>{{ ruta1 }}</w:t>
+            <w:proofErr w:type="gramStart"/>
+            <w:r>
+              <w:rPr>
+                <w:rFonts w:ascii="Arial" w:hAnsi="Arial" w:cs="Arial"/>
+              </w:rPr>
+              <w:t>{{ ruta</w:t>
+            </w:r>
+            <w:proofErr w:type="gramEnd"/>
+            <w:r>
+              <w:rPr>
+                <w:rFonts w:ascii="Arial" w:hAnsi="Arial" w:cs="Arial"/>
+              </w:rPr>
+              <w:t>1 }}</w:t>
             </w:r>
           </w:p>
         </w:tc>
@@ -315,11 +353,19 @@
                 <w:rFonts w:ascii="Arial" w:hAnsi="Arial" w:cs="Arial"/>
               </w:rPr>
             </w:pPr>
-            <w:r>
-              <w:rPr>
-                <w:rFonts w:ascii="Arial" w:hAnsi="Arial" w:cs="Arial"/>
-              </w:rPr>
-              <w:t>{{ salida }}</w:t>
+            <w:proofErr w:type="gramStart"/>
+            <w:r>
+              <w:rPr>
+                <w:rFonts w:ascii="Arial" w:hAnsi="Arial" w:cs="Arial"/>
+              </w:rPr>
+              <w:t>{{ salida</w:t>
+            </w:r>
+            <w:proofErr w:type="gramEnd"/>
+            <w:r>
+              <w:rPr>
+                <w:rFonts w:ascii="Arial" w:hAnsi="Arial" w:cs="Arial"/>
+              </w:rPr>
+              <w:t xml:space="preserve"> }}</w:t>
             </w:r>
           </w:p>
         </w:tc>
@@ -370,11 +416,19 @@
                 <w:rFonts w:ascii="Arial" w:hAnsi="Arial" w:cs="Arial"/>
               </w:rPr>
             </w:pPr>
-            <w:r>
-              <w:rPr>
-                <w:rFonts w:ascii="Arial" w:hAnsi="Arial" w:cs="Arial"/>
-              </w:rPr>
-              <w:t>{{ electrico }}</w:t>
+            <w:proofErr w:type="gramStart"/>
+            <w:r>
+              <w:rPr>
+                <w:rFonts w:ascii="Arial" w:hAnsi="Arial" w:cs="Arial"/>
+              </w:rPr>
+              <w:t>{{ electrico</w:t>
+            </w:r>
+            <w:proofErr w:type="gramEnd"/>
+            <w:r>
+              <w:rPr>
+                <w:rFonts w:ascii="Arial" w:hAnsi="Arial" w:cs="Arial"/>
+              </w:rPr>
+              <w:t xml:space="preserve"> }}</w:t>
             </w:r>
           </w:p>
         </w:tc>
@@ -464,11 +518,19 @@
                 <w:rFonts w:ascii="Arial" w:hAnsi="Arial" w:cs="Arial"/>
               </w:rPr>
             </w:pPr>
-            <w:r>
-              <w:rPr>
-                <w:rFonts w:ascii="Arial" w:hAnsi="Arial" w:cs="Arial"/>
-              </w:rPr>
-              <w:t>{{ pisos }}</w:t>
+            <w:proofErr w:type="gramStart"/>
+            <w:r>
+              <w:rPr>
+                <w:rFonts w:ascii="Arial" w:hAnsi="Arial" w:cs="Arial"/>
+              </w:rPr>
+              <w:t>{{ pisos</w:t>
+            </w:r>
+            <w:proofErr w:type="gramEnd"/>
+            <w:r>
+              <w:rPr>
+                <w:rFonts w:ascii="Arial" w:hAnsi="Arial" w:cs="Arial"/>
+              </w:rPr>
+              <w:t xml:space="preserve"> }}</w:t>
             </w:r>
           </w:p>
         </w:tc>
@@ -519,11 +581,19 @@
                 <w:rFonts w:ascii="Arial" w:hAnsi="Arial" w:cs="Arial"/>
               </w:rPr>
             </w:pPr>
-            <w:r>
-              <w:rPr>
-                <w:rFonts w:ascii="Arial" w:hAnsi="Arial" w:cs="Arial"/>
-              </w:rPr>
-              <w:t>{{ ventanas }}</w:t>
+            <w:proofErr w:type="gramStart"/>
+            <w:r>
+              <w:rPr>
+                <w:rFonts w:ascii="Arial" w:hAnsi="Arial" w:cs="Arial"/>
+              </w:rPr>
+              <w:t>{{ ventanas</w:t>
+            </w:r>
+            <w:proofErr w:type="gramEnd"/>
+            <w:r>
+              <w:rPr>
+                <w:rFonts w:ascii="Arial" w:hAnsi="Arial" w:cs="Arial"/>
+              </w:rPr>
+              <w:t xml:space="preserve"> }}</w:t>
             </w:r>
           </w:p>
         </w:tc>
@@ -574,11 +644,19 @@
                 <w:rFonts w:ascii="Arial" w:hAnsi="Arial" w:cs="Arial"/>
               </w:rPr>
             </w:pPr>
-            <w:r>
-              <w:rPr>
-                <w:rFonts w:ascii="Arial" w:hAnsi="Arial" w:cs="Arial"/>
-              </w:rPr>
-              <w:t>{{ techo }}</w:t>
+            <w:proofErr w:type="gramStart"/>
+            <w:r>
+              <w:rPr>
+                <w:rFonts w:ascii="Arial" w:hAnsi="Arial" w:cs="Arial"/>
+              </w:rPr>
+              <w:t>{{ techo</w:t>
+            </w:r>
+            <w:proofErr w:type="gramEnd"/>
+            <w:r>
+              <w:rPr>
+                <w:rFonts w:ascii="Arial" w:hAnsi="Arial" w:cs="Arial"/>
+              </w:rPr>
+              <w:t xml:space="preserve"> }}</w:t>
             </w:r>
           </w:p>
         </w:tc>
@@ -664,11 +742,19 @@
                 <w:rFonts w:ascii="Arial" w:hAnsi="Arial" w:cs="Arial"/>
               </w:rPr>
             </w:pPr>
-            <w:r>
-              <w:rPr>
-                <w:rFonts w:ascii="Arial" w:hAnsi="Arial" w:cs="Arial"/>
-              </w:rPr>
-              <w:t>{{ banio }}</w:t>
+            <w:proofErr w:type="gramStart"/>
+            <w:r>
+              <w:rPr>
+                <w:rFonts w:ascii="Arial" w:hAnsi="Arial" w:cs="Arial"/>
+              </w:rPr>
+              <w:t>{{ banio</w:t>
+            </w:r>
+            <w:proofErr w:type="gramEnd"/>
+            <w:r>
+              <w:rPr>
+                <w:rFonts w:ascii="Arial" w:hAnsi="Arial" w:cs="Arial"/>
+              </w:rPr>
+              <w:t xml:space="preserve"> }}</w:t>
             </w:r>
           </w:p>
         </w:tc>
@@ -712,11 +798,19 @@
                 <w:rFonts w:ascii="Arial" w:hAnsi="Arial" w:cs="Arial"/>
               </w:rPr>
             </w:pPr>
-            <w:r>
-              <w:rPr>
-                <w:rFonts w:ascii="Arial" w:hAnsi="Arial" w:cs="Arial"/>
-              </w:rPr>
-              <w:t>{{ compresor }}</w:t>
+            <w:proofErr w:type="gramStart"/>
+            <w:r>
+              <w:rPr>
+                <w:rFonts w:ascii="Arial" w:hAnsi="Arial" w:cs="Arial"/>
+              </w:rPr>
+              <w:t>{{ compresor</w:t>
+            </w:r>
+            <w:proofErr w:type="gramEnd"/>
+            <w:r>
+              <w:rPr>
+                <w:rFonts w:ascii="Arial" w:hAnsi="Arial" w:cs="Arial"/>
+              </w:rPr>
+              <w:t xml:space="preserve"> }}</w:t>
             </w:r>
           </w:p>
         </w:tc>
@@ -767,11 +861,19 @@
                 <w:rFonts w:ascii="Arial" w:hAnsi="Arial" w:cs="Arial"/>
               </w:rPr>
             </w:pPr>
-            <w:r>
-              <w:rPr>
-                <w:rFonts w:ascii="Arial" w:hAnsi="Arial" w:cs="Arial"/>
-              </w:rPr>
-              <w:t>{{ botiquin }}</w:t>
+            <w:proofErr w:type="gramStart"/>
+            <w:r>
+              <w:rPr>
+                <w:rFonts w:ascii="Arial" w:hAnsi="Arial" w:cs="Arial"/>
+              </w:rPr>
+              <w:t>{{ botiquin</w:t>
+            </w:r>
+            <w:proofErr w:type="gramEnd"/>
+            <w:r>
+              <w:rPr>
+                <w:rFonts w:ascii="Arial" w:hAnsi="Arial" w:cs="Arial"/>
+              </w:rPr>
+              <w:t xml:space="preserve"> }}</w:t>
             </w:r>
           </w:p>
         </w:tc>
@@ -859,11 +961,19 @@
                 <w:rFonts w:ascii="Arial" w:hAnsi="Arial" w:cs="Arial"/>
               </w:rPr>
             </w:pPr>
-            <w:r>
-              <w:rPr>
-                <w:rFonts w:ascii="Arial" w:hAnsi="Arial" w:cs="Arial"/>
-              </w:rPr>
-              <w:t>{{ alarma }}</w:t>
+            <w:proofErr w:type="gramStart"/>
+            <w:r>
+              <w:rPr>
+                <w:rFonts w:ascii="Arial" w:hAnsi="Arial" w:cs="Arial"/>
+              </w:rPr>
+              <w:t>{{ alarma</w:t>
+            </w:r>
+            <w:proofErr w:type="gramEnd"/>
+            <w:r>
+              <w:rPr>
+                <w:rFonts w:ascii="Arial" w:hAnsi="Arial" w:cs="Arial"/>
+              </w:rPr>
+              <w:t xml:space="preserve"> }}</w:t>
             </w:r>
           </w:p>
         </w:tc>
@@ -914,11 +1024,19 @@
                 <w:rFonts w:ascii="Arial" w:hAnsi="Arial" w:cs="Arial"/>
               </w:rPr>
             </w:pPr>
-            <w:r>
-              <w:rPr>
-                <w:rFonts w:ascii="Arial" w:hAnsi="Arial" w:cs="Arial"/>
-              </w:rPr>
-              <w:t>{{ quimicos }}</w:t>
+            <w:proofErr w:type="gramStart"/>
+            <w:r>
+              <w:rPr>
+                <w:rFonts w:ascii="Arial" w:hAnsi="Arial" w:cs="Arial"/>
+              </w:rPr>
+              <w:t>{{ quimicos</w:t>
+            </w:r>
+            <w:proofErr w:type="gramEnd"/>
+            <w:r>
+              <w:rPr>
+                <w:rFonts w:ascii="Arial" w:hAnsi="Arial" w:cs="Arial"/>
+              </w:rPr>
+              <w:t xml:space="preserve"> }}</w:t>
             </w:r>
           </w:p>
         </w:tc>
@@ -1075,11 +1193,19 @@
                 <w:rFonts w:ascii="Arial" w:hAnsi="Arial" w:cs="Arial"/>
               </w:rPr>
             </w:pPr>
-            <w:r>
-              <w:rPr>
-                <w:rFonts w:ascii="Arial" w:hAnsi="Arial" w:cs="Arial"/>
-              </w:rPr>
-              <w:t>{{ tanques_gaso }}</w:t>
+            <w:proofErr w:type="gramStart"/>
+            <w:r>
+              <w:rPr>
+                <w:rFonts w:ascii="Arial" w:hAnsi="Arial" w:cs="Arial"/>
+              </w:rPr>
+              <w:t>{{ tanques</w:t>
+            </w:r>
+            <w:proofErr w:type="gramEnd"/>
+            <w:r>
+              <w:rPr>
+                <w:rFonts w:ascii="Arial" w:hAnsi="Arial" w:cs="Arial"/>
+              </w:rPr>
+              <w:t>_gaso }}</w:t>
             </w:r>
           </w:p>
         </w:tc>
@@ -1198,11 +1324,19 @@
                 <w:rFonts w:ascii="Arial" w:hAnsi="Arial" w:cs="Arial"/>
               </w:rPr>
             </w:pPr>
-            <w:r>
-              <w:rPr>
-                <w:rFonts w:ascii="Arial" w:hAnsi="Arial" w:cs="Arial"/>
-              </w:rPr>
-              <w:t>{{ paro }}</w:t>
+            <w:proofErr w:type="gramStart"/>
+            <w:r>
+              <w:rPr>
+                <w:rFonts w:ascii="Arial" w:hAnsi="Arial" w:cs="Arial"/>
+              </w:rPr>
+              <w:t>{{ paro</w:t>
+            </w:r>
+            <w:proofErr w:type="gramEnd"/>
+            <w:r>
+              <w:rPr>
+                <w:rFonts w:ascii="Arial" w:hAnsi="Arial" w:cs="Arial"/>
+              </w:rPr>
+              <w:t xml:space="preserve"> }}</w:t>
             </w:r>
           </w:p>
         </w:tc>
@@ -1253,11 +1387,19 @@
                 <w:rFonts w:ascii="Arial" w:hAnsi="Arial" w:cs="Arial"/>
               </w:rPr>
             </w:pPr>
-            <w:r>
-              <w:rPr>
-                <w:rFonts w:ascii="Arial" w:hAnsi="Arial" w:cs="Arial"/>
-              </w:rPr>
-              <w:t>{{ trampa_grasa }}</w:t>
+            <w:proofErr w:type="gramStart"/>
+            <w:r>
+              <w:rPr>
+                <w:rFonts w:ascii="Arial" w:hAnsi="Arial" w:cs="Arial"/>
+              </w:rPr>
+              <w:t>{{ trampa</w:t>
+            </w:r>
+            <w:proofErr w:type="gramEnd"/>
+            <w:r>
+              <w:rPr>
+                <w:rFonts w:ascii="Arial" w:hAnsi="Arial" w:cs="Arial"/>
+              </w:rPr>
+              <w:t>_grasa }}</w:t>
             </w:r>
           </w:p>
         </w:tc>
@@ -1343,11 +1485,19 @@
                 <w:rFonts w:ascii="Arial" w:hAnsi="Arial" w:cs="Arial"/>
               </w:rPr>
             </w:pPr>
-            <w:r>
-              <w:rPr>
-                <w:rFonts w:ascii="Arial" w:hAnsi="Arial" w:cs="Arial"/>
-              </w:rPr>
-              <w:t>{{ site }}</w:t>
+            <w:proofErr w:type="gramStart"/>
+            <w:r>
+              <w:rPr>
+                <w:rFonts w:ascii="Arial" w:hAnsi="Arial" w:cs="Arial"/>
+              </w:rPr>
+              <w:t>{{ site</w:t>
+            </w:r>
+            <w:proofErr w:type="gramEnd"/>
+            <w:r>
+              <w:rPr>
+                <w:rFonts w:ascii="Arial" w:hAnsi="Arial" w:cs="Arial"/>
+              </w:rPr>
+              <w:t xml:space="preserve"> }}</w:t>
             </w:r>
           </w:p>
         </w:tc>
@@ -1436,12 +1586,21 @@
           <w:lang w:eastAsia="es-MX"/>
         </w:rPr>
       </w:pPr>
+      <w:proofErr w:type="gramStart"/>
       <w:r>
         <w:rPr>
           <w:rFonts w:ascii="Arial" w:eastAsia="Times New Roman" w:hAnsi="Arial" w:cs="Arial"/>
           <w:lang w:eastAsia="es-MX"/>
         </w:rPr>
-        <w:t>{{ layout }}</w:t>
+        <w:t>{{ layout</w:t>
+      </w:r>
+      <w:proofErr w:type="gramEnd"/>
+      <w:r>
+        <w:rPr>
+          <w:rFonts w:ascii="Arial" w:eastAsia="Times New Roman" w:hAnsi="Arial" w:cs="Arial"/>
+          <w:lang w:eastAsia="es-MX"/>
+        </w:rPr>
+        <w:t xml:space="preserve"> }}</w:t>
       </w:r>
     </w:p>
     <w:p>
@@ -1552,7 +1711,6 @@
         <w:docPartUnique/>
       </w:docPartObj>
     </w:sdtPr>
-    <w:sdtEndPr/>
     <w:sdtContent>
       <w:sdt>
         <w:sdtPr>
@@ -1562,7 +1720,6 @@
             <w:docPartUnique/>
           </w:docPartObj>
         </w:sdtPr>
-        <w:sdtEndPr/>
         <w:sdtContent>
           <w:p>
             <w:pPr>
@@ -1906,7 +2063,6 @@
         <w:docPartUnique/>
       </w:docPartObj>
     </w:sdtPr>
-    <w:sdtEndPr/>
     <w:sdtContent>
       <w:sdt>
         <w:sdtPr>
@@ -1916,7 +2072,6 @@
             <w:docPartUnique/>
           </w:docPartObj>
         </w:sdtPr>
-        <w:sdtEndPr/>
         <w:sdtContent>
           <w:p>
             <w:pPr>

</xml_diff>

<commit_message>
cargar datos airtable e imganes local
</commit_message>
<xml_diff>
--- a/Inputs/Templates/MF Gasolinera.docx
+++ b/Inputs/Templates/MF Gasolinera.docx
@@ -1,6 +1,6 @@
 
 <file path=word/document.xml><?xml version="1.0" encoding="utf-8"?>
-<w:document xmlns:wpc="http://schemas.microsoft.com/office/word/2010/wordprocessingCanvas" xmlns:cx="http://schemas.microsoft.com/office/drawing/2014/chartex" xmlns:cx1="http://schemas.microsoft.com/office/drawing/2015/9/8/chartex" xmlns:cx2="http://schemas.microsoft.com/office/drawing/2015/10/21/chartex" xmlns:cx3="http://schemas.microsoft.com/office/drawing/2016/5/9/chartex" xmlns:cx4="http://schemas.microsoft.com/office/drawing/2016/5/10/chartex" xmlns:cx5="http://schemas.microsoft.com/office/drawing/2016/5/11/chartex" xmlns:cx6="http://schemas.microsoft.com/office/drawing/2016/5/12/chartex" xmlns:cx7="http://schemas.microsoft.com/office/drawing/2016/5/13/chartex" xmlns:cx8="http://schemas.microsoft.com/office/drawing/2016/5/14/chartex" xmlns:mc="http://schemas.openxmlformats.org/markup-compatibility/2006" xmlns:aink="http://schemas.microsoft.com/office/drawing/2016/ink" xmlns:am3d="http://schemas.microsoft.com/office/drawing/2017/model3d" xmlns:o="urn:schemas-microsoft-com:office:office" xmlns:oel="http://schemas.microsoft.com/office/2019/extlst" xmlns:r="http://schemas.openxmlformats.org/officeDocument/2006/relationships" xmlns:m="http://schemas.openxmlformats.org/officeDocument/2006/math" xmlns:v="urn:schemas-microsoft-com:vml" xmlns:wp14="http://schemas.microsoft.com/office/word/2010/wordprocessingDrawing" xmlns:wp="http://schemas.openxmlformats.org/drawingml/2006/wordprocessingDrawing" xmlns:w10="urn:schemas-microsoft-com:office:word" xmlns:w="http://schemas.openxmlformats.org/wordprocessingml/2006/main" xmlns:w14="http://schemas.microsoft.com/office/word/2010/wordml" xmlns:w15="http://schemas.microsoft.com/office/word/2012/wordml" xmlns:w16cex="http://schemas.microsoft.com/office/word/2018/wordml/cex" xmlns:w16cid="http://schemas.microsoft.com/office/word/2016/wordml/cid" xmlns:w16="http://schemas.microsoft.com/office/word/2018/wordml" xmlns:w16du="http://schemas.microsoft.com/office/word/2023/wordml/word16du" xmlns:w16sdtdh="http://schemas.microsoft.com/office/word/2020/wordml/sdtdatahash" xmlns:w16se="http://schemas.microsoft.com/office/word/2015/wordml/symex" xmlns:wpg="http://schemas.microsoft.com/office/word/2010/wordprocessingGroup" xmlns:wpi="http://schemas.microsoft.com/office/word/2010/wordprocessingInk" xmlns:wne="http://schemas.microsoft.com/office/word/2006/wordml" xmlns:wps="http://schemas.microsoft.com/office/word/2010/wordprocessingShape" mc:Ignorable="w14 w15 w16se w16cid w16 w16cex w16sdtdh w16du wp14">
+<w:document xmlns:wpc="http://schemas.microsoft.com/office/word/2010/wordprocessingCanvas" xmlns:cx="http://schemas.microsoft.com/office/drawing/2014/chartex" xmlns:cx1="http://schemas.microsoft.com/office/drawing/2015/9/8/chartex" xmlns:cx2="http://schemas.microsoft.com/office/drawing/2015/10/21/chartex" xmlns:cx3="http://schemas.microsoft.com/office/drawing/2016/5/9/chartex" xmlns:cx4="http://schemas.microsoft.com/office/drawing/2016/5/10/chartex" xmlns:cx5="http://schemas.microsoft.com/office/drawing/2016/5/11/chartex" xmlns:cx6="http://schemas.microsoft.com/office/drawing/2016/5/12/chartex" xmlns:cx7="http://schemas.microsoft.com/office/drawing/2016/5/13/chartex" xmlns:cx8="http://schemas.microsoft.com/office/drawing/2016/5/14/chartex" xmlns:mc="http://schemas.openxmlformats.org/markup-compatibility/2006" xmlns:aink="http://schemas.microsoft.com/office/drawing/2016/ink" xmlns:am3d="http://schemas.microsoft.com/office/drawing/2017/model3d" xmlns:o="urn:schemas-microsoft-com:office:office" xmlns:oel="http://schemas.microsoft.com/office/2019/extlst" xmlns:r="http://schemas.openxmlformats.org/officeDocument/2006/relationships" xmlns:m="http://schemas.openxmlformats.org/officeDocument/2006/math" xmlns:v="urn:schemas-microsoft-com:vml" xmlns:wp14="http://schemas.microsoft.com/office/word/2010/wordprocessingDrawing" xmlns:wp="http://schemas.openxmlformats.org/drawingml/2006/wordprocessingDrawing" xmlns:w10="urn:schemas-microsoft-com:office:word" xmlns:w="http://schemas.openxmlformats.org/wordprocessingml/2006/main" xmlns:w14="http://schemas.microsoft.com/office/word/2010/wordml" xmlns:w15="http://schemas.microsoft.com/office/word/2012/wordml" xmlns:w16cex="http://schemas.microsoft.com/office/word/2018/wordml/cex" xmlns:w16cid="http://schemas.microsoft.com/office/word/2016/wordml/cid" xmlns:w16="http://schemas.microsoft.com/office/word/2018/wordml" xmlns:w16du="http://schemas.microsoft.com/office/word/2023/wordml/word16du" xmlns:w16sdtdh="http://schemas.microsoft.com/office/word/2020/wordml/sdtdatahash" xmlns:w16sdtfl="http://schemas.microsoft.com/office/word/2024/wordml/sdtformatlock" xmlns:w16se="http://schemas.microsoft.com/office/word/2015/wordml/symex" xmlns:wpg="http://schemas.microsoft.com/office/word/2010/wordprocessingGroup" xmlns:wpi="http://schemas.microsoft.com/office/word/2010/wordprocessingInk" xmlns:wne="http://schemas.microsoft.com/office/word/2006/wordml" xmlns:wps="http://schemas.microsoft.com/office/word/2010/wordprocessingShape" mc:Ignorable="w14 w15 w16se w16cid w16 w16cex w16sdtdh w16sdtfl w16du wp14">
   <w:body>
     <w:p>
       <w:pPr>
@@ -1525,9 +1525,12 @@
           <w:lang w:eastAsia="es-MX"/>
         </w:rPr>
         <w:sectPr>
-          <w:headerReference w:type="default" r:id="rId9"/>
-          <w:footerReference w:type="default" r:id="rId10"/>
-          <w:headerReference w:type="first" r:id="rId11"/>
+          <w:headerReference w:type="even" r:id="rId9"/>
+          <w:headerReference w:type="default" r:id="rId10"/>
+          <w:footerReference w:type="even" r:id="rId11"/>
+          <w:footerReference w:type="default" r:id="rId12"/>
+          <w:headerReference w:type="first" r:id="rId13"/>
+          <w:footerReference w:type="first" r:id="rId14"/>
           <w:pgSz w:w="12240" w:h="15840"/>
           <w:pgMar w:top="1500" w:right="1701" w:bottom="1417" w:left="1701" w:header="568" w:footer="370" w:gutter="0"/>
           <w:pgNumType w:start="1"/>
@@ -1553,9 +1556,9 @@
       </w:pPr>
     </w:p>
     <w:sectPr>
-      <w:headerReference w:type="default" r:id="rId12"/>
-      <w:footerReference w:type="default" r:id="rId13"/>
-      <w:headerReference w:type="first" r:id="rId14"/>
+      <w:headerReference w:type="default" r:id="rId15"/>
+      <w:footerReference w:type="default" r:id="rId16"/>
+      <w:headerReference w:type="first" r:id="rId17"/>
       <w:type w:val="continuous"/>
       <w:pgSz w:w="12240" w:h="15840"/>
       <w:pgMar w:top="1500" w:right="1701" w:bottom="1417" w:left="1701" w:header="568" w:footer="370" w:gutter="0"/>
@@ -1568,7 +1571,7 @@
 </file>
 
 <file path=word/endnotes.xml><?xml version="1.0" encoding="utf-8"?>
-<w:endnotes xmlns:wpc="http://schemas.microsoft.com/office/word/2010/wordprocessingCanvas" xmlns:cx="http://schemas.microsoft.com/office/drawing/2014/chartex" xmlns:cx1="http://schemas.microsoft.com/office/drawing/2015/9/8/chartex" xmlns:cx2="http://schemas.microsoft.com/office/drawing/2015/10/21/chartex" xmlns:cx3="http://schemas.microsoft.com/office/drawing/2016/5/9/chartex" xmlns:cx4="http://schemas.microsoft.com/office/drawing/2016/5/10/chartex" xmlns:cx5="http://schemas.microsoft.com/office/drawing/2016/5/11/chartex" xmlns:cx6="http://schemas.microsoft.com/office/drawing/2016/5/12/chartex" xmlns:cx7="http://schemas.microsoft.com/office/drawing/2016/5/13/chartex" xmlns:cx8="http://schemas.microsoft.com/office/drawing/2016/5/14/chartex" xmlns:mc="http://schemas.openxmlformats.org/markup-compatibility/2006" xmlns:aink="http://schemas.microsoft.com/office/drawing/2016/ink" xmlns:am3d="http://schemas.microsoft.com/office/drawing/2017/model3d" xmlns:o="urn:schemas-microsoft-com:office:office" xmlns:oel="http://schemas.microsoft.com/office/2019/extlst" xmlns:r="http://schemas.openxmlformats.org/officeDocument/2006/relationships" xmlns:m="http://schemas.openxmlformats.org/officeDocument/2006/math" xmlns:v="urn:schemas-microsoft-com:vml" xmlns:wp14="http://schemas.microsoft.com/office/word/2010/wordprocessingDrawing" xmlns:wp="http://schemas.openxmlformats.org/drawingml/2006/wordprocessingDrawing" xmlns:w10="urn:schemas-microsoft-com:office:word" xmlns:w="http://schemas.openxmlformats.org/wordprocessingml/2006/main" xmlns:w14="http://schemas.microsoft.com/office/word/2010/wordml" xmlns:w15="http://schemas.microsoft.com/office/word/2012/wordml" xmlns:w16cex="http://schemas.microsoft.com/office/word/2018/wordml/cex" xmlns:w16cid="http://schemas.microsoft.com/office/word/2016/wordml/cid" xmlns:w16="http://schemas.microsoft.com/office/word/2018/wordml" xmlns:w16du="http://schemas.microsoft.com/office/word/2023/wordml/word16du" xmlns:w16sdtdh="http://schemas.microsoft.com/office/word/2020/wordml/sdtdatahash" xmlns:w16se="http://schemas.microsoft.com/office/word/2015/wordml/symex" xmlns:wpg="http://schemas.microsoft.com/office/word/2010/wordprocessingGroup" xmlns:wpi="http://schemas.microsoft.com/office/word/2010/wordprocessingInk" xmlns:wne="http://schemas.microsoft.com/office/word/2006/wordml" xmlns:wps="http://schemas.microsoft.com/office/word/2010/wordprocessingShape" mc:Ignorable="w14 w15 w16se w16cid w16 w16cex w16sdtdh w16du wp14">
+<w:endnotes xmlns:wpc="http://schemas.microsoft.com/office/word/2010/wordprocessingCanvas" xmlns:cx="http://schemas.microsoft.com/office/drawing/2014/chartex" xmlns:cx1="http://schemas.microsoft.com/office/drawing/2015/9/8/chartex" xmlns:cx2="http://schemas.microsoft.com/office/drawing/2015/10/21/chartex" xmlns:cx3="http://schemas.microsoft.com/office/drawing/2016/5/9/chartex" xmlns:cx4="http://schemas.microsoft.com/office/drawing/2016/5/10/chartex" xmlns:cx5="http://schemas.microsoft.com/office/drawing/2016/5/11/chartex" xmlns:cx6="http://schemas.microsoft.com/office/drawing/2016/5/12/chartex" xmlns:cx7="http://schemas.microsoft.com/office/drawing/2016/5/13/chartex" xmlns:cx8="http://schemas.microsoft.com/office/drawing/2016/5/14/chartex" xmlns:mc="http://schemas.openxmlformats.org/markup-compatibility/2006" xmlns:aink="http://schemas.microsoft.com/office/drawing/2016/ink" xmlns:am3d="http://schemas.microsoft.com/office/drawing/2017/model3d" xmlns:o="urn:schemas-microsoft-com:office:office" xmlns:oel="http://schemas.microsoft.com/office/2019/extlst" xmlns:r="http://schemas.openxmlformats.org/officeDocument/2006/relationships" xmlns:m="http://schemas.openxmlformats.org/officeDocument/2006/math" xmlns:v="urn:schemas-microsoft-com:vml" xmlns:wp14="http://schemas.microsoft.com/office/word/2010/wordprocessingDrawing" xmlns:wp="http://schemas.openxmlformats.org/drawingml/2006/wordprocessingDrawing" xmlns:w10="urn:schemas-microsoft-com:office:word" xmlns:w="http://schemas.openxmlformats.org/wordprocessingml/2006/main" xmlns:w14="http://schemas.microsoft.com/office/word/2010/wordml" xmlns:w15="http://schemas.microsoft.com/office/word/2012/wordml" xmlns:w16cex="http://schemas.microsoft.com/office/word/2018/wordml/cex" xmlns:w16cid="http://schemas.microsoft.com/office/word/2016/wordml/cid" xmlns:w16="http://schemas.microsoft.com/office/word/2018/wordml" xmlns:w16du="http://schemas.microsoft.com/office/word/2023/wordml/word16du" xmlns:w16sdtdh="http://schemas.microsoft.com/office/word/2020/wordml/sdtdatahash" xmlns:w16sdtfl="http://schemas.microsoft.com/office/word/2024/wordml/sdtformatlock" xmlns:w16se="http://schemas.microsoft.com/office/word/2015/wordml/symex" xmlns:wpg="http://schemas.microsoft.com/office/word/2010/wordprocessingGroup" xmlns:wpi="http://schemas.microsoft.com/office/word/2010/wordprocessingInk" xmlns:wne="http://schemas.microsoft.com/office/word/2006/wordml" xmlns:wps="http://schemas.microsoft.com/office/word/2010/wordprocessingShape" mc:Ignorable="w14 w15 w16se w16cid w16 w16cex w16sdtdh w16sdtfl w16du wp14">
   <w:endnote w:type="separator" w:id="-1">
     <w:p>
       <w:pPr>
@@ -1593,7 +1596,17 @@
 </file>
 
 <file path=word/footer1.xml><?xml version="1.0" encoding="utf-8"?>
-<w:ftr xmlns:wpc="http://schemas.microsoft.com/office/word/2010/wordprocessingCanvas" xmlns:cx="http://schemas.microsoft.com/office/drawing/2014/chartex" xmlns:cx1="http://schemas.microsoft.com/office/drawing/2015/9/8/chartex" xmlns:cx2="http://schemas.microsoft.com/office/drawing/2015/10/21/chartex" xmlns:cx3="http://schemas.microsoft.com/office/drawing/2016/5/9/chartex" xmlns:cx4="http://schemas.microsoft.com/office/drawing/2016/5/10/chartex" xmlns:cx5="http://schemas.microsoft.com/office/drawing/2016/5/11/chartex" xmlns:cx6="http://schemas.microsoft.com/office/drawing/2016/5/12/chartex" xmlns:cx7="http://schemas.microsoft.com/office/drawing/2016/5/13/chartex" xmlns:cx8="http://schemas.microsoft.com/office/drawing/2016/5/14/chartex" xmlns:mc="http://schemas.openxmlformats.org/markup-compatibility/2006" xmlns:aink="http://schemas.microsoft.com/office/drawing/2016/ink" xmlns:am3d="http://schemas.microsoft.com/office/drawing/2017/model3d" xmlns:o="urn:schemas-microsoft-com:office:office" xmlns:oel="http://schemas.microsoft.com/office/2019/extlst" xmlns:r="http://schemas.openxmlformats.org/officeDocument/2006/relationships" xmlns:m="http://schemas.openxmlformats.org/officeDocument/2006/math" xmlns:v="urn:schemas-microsoft-com:vml" xmlns:wp14="http://schemas.microsoft.com/office/word/2010/wordprocessingDrawing" xmlns:wp="http://schemas.openxmlformats.org/drawingml/2006/wordprocessingDrawing" xmlns:w10="urn:schemas-microsoft-com:office:word" xmlns:w="http://schemas.openxmlformats.org/wordprocessingml/2006/main" xmlns:w14="http://schemas.microsoft.com/office/word/2010/wordml" xmlns:w15="http://schemas.microsoft.com/office/word/2012/wordml" xmlns:w16cex="http://schemas.microsoft.com/office/word/2018/wordml/cex" xmlns:w16cid="http://schemas.microsoft.com/office/word/2016/wordml/cid" xmlns:w16="http://schemas.microsoft.com/office/word/2018/wordml" xmlns:w16du="http://schemas.microsoft.com/office/word/2023/wordml/word16du" xmlns:w16sdtdh="http://schemas.microsoft.com/office/word/2020/wordml/sdtdatahash" xmlns:w16se="http://schemas.microsoft.com/office/word/2015/wordml/symex" xmlns:wpg="http://schemas.microsoft.com/office/word/2010/wordprocessingGroup" xmlns:wpi="http://schemas.microsoft.com/office/word/2010/wordprocessingInk" xmlns:wne="http://schemas.microsoft.com/office/word/2006/wordml" xmlns:wps="http://schemas.microsoft.com/office/word/2010/wordprocessingShape" mc:Ignorable="w14 w15 w16se w16cid w16 w16cex w16sdtdh w16du wp14">
+<w:ftr xmlns:wpc="http://schemas.microsoft.com/office/word/2010/wordprocessingCanvas" xmlns:cx="http://schemas.microsoft.com/office/drawing/2014/chartex" xmlns:cx1="http://schemas.microsoft.com/office/drawing/2015/9/8/chartex" xmlns:cx2="http://schemas.microsoft.com/office/drawing/2015/10/21/chartex" xmlns:cx3="http://schemas.microsoft.com/office/drawing/2016/5/9/chartex" xmlns:cx4="http://schemas.microsoft.com/office/drawing/2016/5/10/chartex" xmlns:cx5="http://schemas.microsoft.com/office/drawing/2016/5/11/chartex" xmlns:cx6="http://schemas.microsoft.com/office/drawing/2016/5/12/chartex" xmlns:cx7="http://schemas.microsoft.com/office/drawing/2016/5/13/chartex" xmlns:cx8="http://schemas.microsoft.com/office/drawing/2016/5/14/chartex" xmlns:mc="http://schemas.openxmlformats.org/markup-compatibility/2006" xmlns:aink="http://schemas.microsoft.com/office/drawing/2016/ink" xmlns:am3d="http://schemas.microsoft.com/office/drawing/2017/model3d" xmlns:o="urn:schemas-microsoft-com:office:office" xmlns:oel="http://schemas.microsoft.com/office/2019/extlst" xmlns:r="http://schemas.openxmlformats.org/officeDocument/2006/relationships" xmlns:m="http://schemas.openxmlformats.org/officeDocument/2006/math" xmlns:v="urn:schemas-microsoft-com:vml" xmlns:wp14="http://schemas.microsoft.com/office/word/2010/wordprocessingDrawing" xmlns:wp="http://schemas.openxmlformats.org/drawingml/2006/wordprocessingDrawing" xmlns:w10="urn:schemas-microsoft-com:office:word" xmlns:w="http://schemas.openxmlformats.org/wordprocessingml/2006/main" xmlns:w14="http://schemas.microsoft.com/office/word/2010/wordml" xmlns:w15="http://schemas.microsoft.com/office/word/2012/wordml" xmlns:w16cex="http://schemas.microsoft.com/office/word/2018/wordml/cex" xmlns:w16cid="http://schemas.microsoft.com/office/word/2016/wordml/cid" xmlns:w16="http://schemas.microsoft.com/office/word/2018/wordml" xmlns:w16du="http://schemas.microsoft.com/office/word/2023/wordml/word16du" xmlns:w16sdtdh="http://schemas.microsoft.com/office/word/2020/wordml/sdtdatahash" xmlns:w16sdtfl="http://schemas.microsoft.com/office/word/2024/wordml/sdtformatlock" xmlns:w16se="http://schemas.microsoft.com/office/word/2015/wordml/symex" xmlns:wpg="http://schemas.microsoft.com/office/word/2010/wordprocessingGroup" xmlns:wpi="http://schemas.microsoft.com/office/word/2010/wordprocessingInk" xmlns:wne="http://schemas.microsoft.com/office/word/2006/wordml" xmlns:wps="http://schemas.microsoft.com/office/word/2010/wordprocessingShape" mc:Ignorable="w14 w15 w16se w16cid w16 w16cex w16sdtdh w16sdtfl w16du wp14">
+  <w:p>
+    <w:pPr>
+      <w:pStyle w:val="Piedepgina"/>
+    </w:pPr>
+  </w:p>
+</w:ftr>
+</file>
+
+<file path=word/footer2.xml><?xml version="1.0" encoding="utf-8"?>
+<w:ftr xmlns:wpc="http://schemas.microsoft.com/office/word/2010/wordprocessingCanvas" xmlns:cx="http://schemas.microsoft.com/office/drawing/2014/chartex" xmlns:cx1="http://schemas.microsoft.com/office/drawing/2015/9/8/chartex" xmlns:cx2="http://schemas.microsoft.com/office/drawing/2015/10/21/chartex" xmlns:cx3="http://schemas.microsoft.com/office/drawing/2016/5/9/chartex" xmlns:cx4="http://schemas.microsoft.com/office/drawing/2016/5/10/chartex" xmlns:cx5="http://schemas.microsoft.com/office/drawing/2016/5/11/chartex" xmlns:cx6="http://schemas.microsoft.com/office/drawing/2016/5/12/chartex" xmlns:cx7="http://schemas.microsoft.com/office/drawing/2016/5/13/chartex" xmlns:cx8="http://schemas.microsoft.com/office/drawing/2016/5/14/chartex" xmlns:mc="http://schemas.openxmlformats.org/markup-compatibility/2006" xmlns:aink="http://schemas.microsoft.com/office/drawing/2016/ink" xmlns:am3d="http://schemas.microsoft.com/office/drawing/2017/model3d" xmlns:o="urn:schemas-microsoft-com:office:office" xmlns:oel="http://schemas.microsoft.com/office/2019/extlst" xmlns:r="http://schemas.openxmlformats.org/officeDocument/2006/relationships" xmlns:m="http://schemas.openxmlformats.org/officeDocument/2006/math" xmlns:v="urn:schemas-microsoft-com:vml" xmlns:wp14="http://schemas.microsoft.com/office/word/2010/wordprocessingDrawing" xmlns:wp="http://schemas.openxmlformats.org/drawingml/2006/wordprocessingDrawing" xmlns:w10="urn:schemas-microsoft-com:office:word" xmlns:w="http://schemas.openxmlformats.org/wordprocessingml/2006/main" xmlns:w14="http://schemas.microsoft.com/office/word/2010/wordml" xmlns:w15="http://schemas.microsoft.com/office/word/2012/wordml" xmlns:w16cex="http://schemas.microsoft.com/office/word/2018/wordml/cex" xmlns:w16cid="http://schemas.microsoft.com/office/word/2016/wordml/cid" xmlns:w16="http://schemas.microsoft.com/office/word/2018/wordml" xmlns:w16du="http://schemas.microsoft.com/office/word/2023/wordml/word16du" xmlns:w16sdtdh="http://schemas.microsoft.com/office/word/2020/wordml/sdtdatahash" xmlns:w16sdtfl="http://schemas.microsoft.com/office/word/2024/wordml/sdtformatlock" xmlns:w16se="http://schemas.microsoft.com/office/word/2015/wordml/symex" xmlns:wpg="http://schemas.microsoft.com/office/word/2010/wordprocessingGroup" xmlns:wpi="http://schemas.microsoft.com/office/word/2010/wordprocessingInk" xmlns:wne="http://schemas.microsoft.com/office/word/2006/wordml" xmlns:wps="http://schemas.microsoft.com/office/word/2010/wordprocessingShape" mc:Ignorable="w14 w15 w16se w16cid w16 w16cex w16sdtdh w16sdtfl w16du wp14">
   <w:sdt>
     <w:sdtPr>
       <w:id w:val="740374177"/>
@@ -1946,8 +1959,18 @@
 </w:ftr>
 </file>
 
-<file path=word/footer2.xml><?xml version="1.0" encoding="utf-8"?>
-<w:ftr xmlns:wpc="http://schemas.microsoft.com/office/word/2010/wordprocessingCanvas" xmlns:cx="http://schemas.microsoft.com/office/drawing/2014/chartex" xmlns:cx1="http://schemas.microsoft.com/office/drawing/2015/9/8/chartex" xmlns:cx2="http://schemas.microsoft.com/office/drawing/2015/10/21/chartex" xmlns:cx3="http://schemas.microsoft.com/office/drawing/2016/5/9/chartex" xmlns:cx4="http://schemas.microsoft.com/office/drawing/2016/5/10/chartex" xmlns:cx5="http://schemas.microsoft.com/office/drawing/2016/5/11/chartex" xmlns:cx6="http://schemas.microsoft.com/office/drawing/2016/5/12/chartex" xmlns:cx7="http://schemas.microsoft.com/office/drawing/2016/5/13/chartex" xmlns:cx8="http://schemas.microsoft.com/office/drawing/2016/5/14/chartex" xmlns:mc="http://schemas.openxmlformats.org/markup-compatibility/2006" xmlns:aink="http://schemas.microsoft.com/office/drawing/2016/ink" xmlns:am3d="http://schemas.microsoft.com/office/drawing/2017/model3d" xmlns:o="urn:schemas-microsoft-com:office:office" xmlns:oel="http://schemas.microsoft.com/office/2019/extlst" xmlns:r="http://schemas.openxmlformats.org/officeDocument/2006/relationships" xmlns:m="http://schemas.openxmlformats.org/officeDocument/2006/math" xmlns:v="urn:schemas-microsoft-com:vml" xmlns:wp14="http://schemas.microsoft.com/office/word/2010/wordprocessingDrawing" xmlns:wp="http://schemas.openxmlformats.org/drawingml/2006/wordprocessingDrawing" xmlns:w10="urn:schemas-microsoft-com:office:word" xmlns:w="http://schemas.openxmlformats.org/wordprocessingml/2006/main" xmlns:w14="http://schemas.microsoft.com/office/word/2010/wordml" xmlns:w15="http://schemas.microsoft.com/office/word/2012/wordml" xmlns:w16cex="http://schemas.microsoft.com/office/word/2018/wordml/cex" xmlns:w16cid="http://schemas.microsoft.com/office/word/2016/wordml/cid" xmlns:w16="http://schemas.microsoft.com/office/word/2018/wordml" xmlns:w16du="http://schemas.microsoft.com/office/word/2023/wordml/word16du" xmlns:w16sdtdh="http://schemas.microsoft.com/office/word/2020/wordml/sdtdatahash" xmlns:w16se="http://schemas.microsoft.com/office/word/2015/wordml/symex" xmlns:wpg="http://schemas.microsoft.com/office/word/2010/wordprocessingGroup" xmlns:wpi="http://schemas.microsoft.com/office/word/2010/wordprocessingInk" xmlns:wne="http://schemas.microsoft.com/office/word/2006/wordml" xmlns:wps="http://schemas.microsoft.com/office/word/2010/wordprocessingShape" mc:Ignorable="w14 w15 w16se w16cid w16 w16cex w16sdtdh w16du wp14">
+<file path=word/footer3.xml><?xml version="1.0" encoding="utf-8"?>
+<w:ftr xmlns:wpc="http://schemas.microsoft.com/office/word/2010/wordprocessingCanvas" xmlns:cx="http://schemas.microsoft.com/office/drawing/2014/chartex" xmlns:cx1="http://schemas.microsoft.com/office/drawing/2015/9/8/chartex" xmlns:cx2="http://schemas.microsoft.com/office/drawing/2015/10/21/chartex" xmlns:cx3="http://schemas.microsoft.com/office/drawing/2016/5/9/chartex" xmlns:cx4="http://schemas.microsoft.com/office/drawing/2016/5/10/chartex" xmlns:cx5="http://schemas.microsoft.com/office/drawing/2016/5/11/chartex" xmlns:cx6="http://schemas.microsoft.com/office/drawing/2016/5/12/chartex" xmlns:cx7="http://schemas.microsoft.com/office/drawing/2016/5/13/chartex" xmlns:cx8="http://schemas.microsoft.com/office/drawing/2016/5/14/chartex" xmlns:mc="http://schemas.openxmlformats.org/markup-compatibility/2006" xmlns:aink="http://schemas.microsoft.com/office/drawing/2016/ink" xmlns:am3d="http://schemas.microsoft.com/office/drawing/2017/model3d" xmlns:o="urn:schemas-microsoft-com:office:office" xmlns:oel="http://schemas.microsoft.com/office/2019/extlst" xmlns:r="http://schemas.openxmlformats.org/officeDocument/2006/relationships" xmlns:m="http://schemas.openxmlformats.org/officeDocument/2006/math" xmlns:v="urn:schemas-microsoft-com:vml" xmlns:wp14="http://schemas.microsoft.com/office/word/2010/wordprocessingDrawing" xmlns:wp="http://schemas.openxmlformats.org/drawingml/2006/wordprocessingDrawing" xmlns:w10="urn:schemas-microsoft-com:office:word" xmlns:w="http://schemas.openxmlformats.org/wordprocessingml/2006/main" xmlns:w14="http://schemas.microsoft.com/office/word/2010/wordml" xmlns:w15="http://schemas.microsoft.com/office/word/2012/wordml" xmlns:w16cex="http://schemas.microsoft.com/office/word/2018/wordml/cex" xmlns:w16cid="http://schemas.microsoft.com/office/word/2016/wordml/cid" xmlns:w16="http://schemas.microsoft.com/office/word/2018/wordml" xmlns:w16du="http://schemas.microsoft.com/office/word/2023/wordml/word16du" xmlns:w16sdtdh="http://schemas.microsoft.com/office/word/2020/wordml/sdtdatahash" xmlns:w16sdtfl="http://schemas.microsoft.com/office/word/2024/wordml/sdtformatlock" xmlns:w16se="http://schemas.microsoft.com/office/word/2015/wordml/symex" xmlns:wpg="http://schemas.microsoft.com/office/word/2010/wordprocessingGroup" xmlns:wpi="http://schemas.microsoft.com/office/word/2010/wordprocessingInk" xmlns:wne="http://schemas.microsoft.com/office/word/2006/wordml" xmlns:wps="http://schemas.microsoft.com/office/word/2010/wordprocessingShape" mc:Ignorable="w14 w15 w16se w16cid w16 w16cex w16sdtdh w16sdtfl w16du wp14">
+  <w:p>
+    <w:pPr>
+      <w:pStyle w:val="Piedepgina"/>
+    </w:pPr>
+  </w:p>
+</w:ftr>
+</file>
+
+<file path=word/footer4.xml><?xml version="1.0" encoding="utf-8"?>
+<w:ftr xmlns:wpc="http://schemas.microsoft.com/office/word/2010/wordprocessingCanvas" xmlns:cx="http://schemas.microsoft.com/office/drawing/2014/chartex" xmlns:cx1="http://schemas.microsoft.com/office/drawing/2015/9/8/chartex" xmlns:cx2="http://schemas.microsoft.com/office/drawing/2015/10/21/chartex" xmlns:cx3="http://schemas.microsoft.com/office/drawing/2016/5/9/chartex" xmlns:cx4="http://schemas.microsoft.com/office/drawing/2016/5/10/chartex" xmlns:cx5="http://schemas.microsoft.com/office/drawing/2016/5/11/chartex" xmlns:cx6="http://schemas.microsoft.com/office/drawing/2016/5/12/chartex" xmlns:cx7="http://schemas.microsoft.com/office/drawing/2016/5/13/chartex" xmlns:cx8="http://schemas.microsoft.com/office/drawing/2016/5/14/chartex" xmlns:mc="http://schemas.openxmlformats.org/markup-compatibility/2006" xmlns:aink="http://schemas.microsoft.com/office/drawing/2016/ink" xmlns:am3d="http://schemas.microsoft.com/office/drawing/2017/model3d" xmlns:o="urn:schemas-microsoft-com:office:office" xmlns:oel="http://schemas.microsoft.com/office/2019/extlst" xmlns:r="http://schemas.openxmlformats.org/officeDocument/2006/relationships" xmlns:m="http://schemas.openxmlformats.org/officeDocument/2006/math" xmlns:v="urn:schemas-microsoft-com:vml" xmlns:wp14="http://schemas.microsoft.com/office/word/2010/wordprocessingDrawing" xmlns:wp="http://schemas.openxmlformats.org/drawingml/2006/wordprocessingDrawing" xmlns:w10="urn:schemas-microsoft-com:office:word" xmlns:w="http://schemas.openxmlformats.org/wordprocessingml/2006/main" xmlns:w14="http://schemas.microsoft.com/office/word/2010/wordml" xmlns:w15="http://schemas.microsoft.com/office/word/2012/wordml" xmlns:w16cex="http://schemas.microsoft.com/office/word/2018/wordml/cex" xmlns:w16cid="http://schemas.microsoft.com/office/word/2016/wordml/cid" xmlns:w16="http://schemas.microsoft.com/office/word/2018/wordml" xmlns:w16du="http://schemas.microsoft.com/office/word/2023/wordml/word16du" xmlns:w16sdtdh="http://schemas.microsoft.com/office/word/2020/wordml/sdtdatahash" xmlns:w16sdtfl="http://schemas.microsoft.com/office/word/2024/wordml/sdtformatlock" xmlns:w16se="http://schemas.microsoft.com/office/word/2015/wordml/symex" xmlns:wpg="http://schemas.microsoft.com/office/word/2010/wordprocessingGroup" xmlns:wpi="http://schemas.microsoft.com/office/word/2010/wordprocessingInk" xmlns:wne="http://schemas.microsoft.com/office/word/2006/wordml" xmlns:wps="http://schemas.microsoft.com/office/word/2010/wordprocessingShape" mc:Ignorable="w14 w15 w16se w16cid w16 w16cex w16sdtdh w16sdtfl w16du wp14">
   <w:sdt>
     <w:sdtPr>
       <w:id w:val="-1610963637"/>
@@ -2301,7 +2324,7 @@
 </file>
 
 <file path=word/footnotes.xml><?xml version="1.0" encoding="utf-8"?>
-<w:footnotes xmlns:wpc="http://schemas.microsoft.com/office/word/2010/wordprocessingCanvas" xmlns:cx="http://schemas.microsoft.com/office/drawing/2014/chartex" xmlns:cx1="http://schemas.microsoft.com/office/drawing/2015/9/8/chartex" xmlns:cx2="http://schemas.microsoft.com/office/drawing/2015/10/21/chartex" xmlns:cx3="http://schemas.microsoft.com/office/drawing/2016/5/9/chartex" xmlns:cx4="http://schemas.microsoft.com/office/drawing/2016/5/10/chartex" xmlns:cx5="http://schemas.microsoft.com/office/drawing/2016/5/11/chartex" xmlns:cx6="http://schemas.microsoft.com/office/drawing/2016/5/12/chartex" xmlns:cx7="http://schemas.microsoft.com/office/drawing/2016/5/13/chartex" xmlns:cx8="http://schemas.microsoft.com/office/drawing/2016/5/14/chartex" xmlns:mc="http://schemas.openxmlformats.org/markup-compatibility/2006" xmlns:aink="http://schemas.microsoft.com/office/drawing/2016/ink" xmlns:am3d="http://schemas.microsoft.com/office/drawing/2017/model3d" xmlns:o="urn:schemas-microsoft-com:office:office" xmlns:oel="http://schemas.microsoft.com/office/2019/extlst" xmlns:r="http://schemas.openxmlformats.org/officeDocument/2006/relationships" xmlns:m="http://schemas.openxmlformats.org/officeDocument/2006/math" xmlns:v="urn:schemas-microsoft-com:vml" xmlns:wp14="http://schemas.microsoft.com/office/word/2010/wordprocessingDrawing" xmlns:wp="http://schemas.openxmlformats.org/drawingml/2006/wordprocessingDrawing" xmlns:w10="urn:schemas-microsoft-com:office:word" xmlns:w="http://schemas.openxmlformats.org/wordprocessingml/2006/main" xmlns:w14="http://schemas.microsoft.com/office/word/2010/wordml" xmlns:w15="http://schemas.microsoft.com/office/word/2012/wordml" xmlns:w16cex="http://schemas.microsoft.com/office/word/2018/wordml/cex" xmlns:w16cid="http://schemas.microsoft.com/office/word/2016/wordml/cid" xmlns:w16="http://schemas.microsoft.com/office/word/2018/wordml" xmlns:w16du="http://schemas.microsoft.com/office/word/2023/wordml/word16du" xmlns:w16sdtdh="http://schemas.microsoft.com/office/word/2020/wordml/sdtdatahash" xmlns:w16se="http://schemas.microsoft.com/office/word/2015/wordml/symex" xmlns:wpg="http://schemas.microsoft.com/office/word/2010/wordprocessingGroup" xmlns:wpi="http://schemas.microsoft.com/office/word/2010/wordprocessingInk" xmlns:wne="http://schemas.microsoft.com/office/word/2006/wordml" xmlns:wps="http://schemas.microsoft.com/office/word/2010/wordprocessingShape" mc:Ignorable="w14 w15 w16se w16cid w16 w16cex w16sdtdh w16du wp14">
+<w:footnotes xmlns:wpc="http://schemas.microsoft.com/office/word/2010/wordprocessingCanvas" xmlns:cx="http://schemas.microsoft.com/office/drawing/2014/chartex" xmlns:cx1="http://schemas.microsoft.com/office/drawing/2015/9/8/chartex" xmlns:cx2="http://schemas.microsoft.com/office/drawing/2015/10/21/chartex" xmlns:cx3="http://schemas.microsoft.com/office/drawing/2016/5/9/chartex" xmlns:cx4="http://schemas.microsoft.com/office/drawing/2016/5/10/chartex" xmlns:cx5="http://schemas.microsoft.com/office/drawing/2016/5/11/chartex" xmlns:cx6="http://schemas.microsoft.com/office/drawing/2016/5/12/chartex" xmlns:cx7="http://schemas.microsoft.com/office/drawing/2016/5/13/chartex" xmlns:cx8="http://schemas.microsoft.com/office/drawing/2016/5/14/chartex" xmlns:mc="http://schemas.openxmlformats.org/markup-compatibility/2006" xmlns:aink="http://schemas.microsoft.com/office/drawing/2016/ink" xmlns:am3d="http://schemas.microsoft.com/office/drawing/2017/model3d" xmlns:o="urn:schemas-microsoft-com:office:office" xmlns:oel="http://schemas.microsoft.com/office/2019/extlst" xmlns:r="http://schemas.openxmlformats.org/officeDocument/2006/relationships" xmlns:m="http://schemas.openxmlformats.org/officeDocument/2006/math" xmlns:v="urn:schemas-microsoft-com:vml" xmlns:wp14="http://schemas.microsoft.com/office/word/2010/wordprocessingDrawing" xmlns:wp="http://schemas.openxmlformats.org/drawingml/2006/wordprocessingDrawing" xmlns:w10="urn:schemas-microsoft-com:office:word" xmlns:w="http://schemas.openxmlformats.org/wordprocessingml/2006/main" xmlns:w14="http://schemas.microsoft.com/office/word/2010/wordml" xmlns:w15="http://schemas.microsoft.com/office/word/2012/wordml" xmlns:w16cex="http://schemas.microsoft.com/office/word/2018/wordml/cex" xmlns:w16cid="http://schemas.microsoft.com/office/word/2016/wordml/cid" xmlns:w16="http://schemas.microsoft.com/office/word/2018/wordml" xmlns:w16du="http://schemas.microsoft.com/office/word/2023/wordml/word16du" xmlns:w16sdtdh="http://schemas.microsoft.com/office/word/2020/wordml/sdtdatahash" xmlns:w16sdtfl="http://schemas.microsoft.com/office/word/2024/wordml/sdtformatlock" xmlns:w16se="http://schemas.microsoft.com/office/word/2015/wordml/symex" xmlns:wpg="http://schemas.microsoft.com/office/word/2010/wordprocessingGroup" xmlns:wpi="http://schemas.microsoft.com/office/word/2010/wordprocessingInk" xmlns:wne="http://schemas.microsoft.com/office/word/2006/wordml" xmlns:wps="http://schemas.microsoft.com/office/word/2010/wordprocessingShape" mc:Ignorable="w14 w15 w16se w16cid w16 w16cex w16sdtdh w16sdtfl w16du wp14">
   <w:footnote w:type="separator" w:id="-1">
     <w:p>
       <w:pPr>
@@ -2326,7 +2349,17 @@
 </file>
 
 <file path=word/header1.xml><?xml version="1.0" encoding="utf-8"?>
-<w:hdr xmlns:wpc="http://schemas.microsoft.com/office/word/2010/wordprocessingCanvas" xmlns:cx="http://schemas.microsoft.com/office/drawing/2014/chartex" xmlns:cx1="http://schemas.microsoft.com/office/drawing/2015/9/8/chartex" xmlns:cx2="http://schemas.microsoft.com/office/drawing/2015/10/21/chartex" xmlns:cx3="http://schemas.microsoft.com/office/drawing/2016/5/9/chartex" xmlns:cx4="http://schemas.microsoft.com/office/drawing/2016/5/10/chartex" xmlns:cx5="http://schemas.microsoft.com/office/drawing/2016/5/11/chartex" xmlns:cx6="http://schemas.microsoft.com/office/drawing/2016/5/12/chartex" xmlns:cx7="http://schemas.microsoft.com/office/drawing/2016/5/13/chartex" xmlns:cx8="http://schemas.microsoft.com/office/drawing/2016/5/14/chartex" xmlns:mc="http://schemas.openxmlformats.org/markup-compatibility/2006" xmlns:aink="http://schemas.microsoft.com/office/drawing/2016/ink" xmlns:am3d="http://schemas.microsoft.com/office/drawing/2017/model3d" xmlns:o="urn:schemas-microsoft-com:office:office" xmlns:oel="http://schemas.microsoft.com/office/2019/extlst" xmlns:r="http://schemas.openxmlformats.org/officeDocument/2006/relationships" xmlns:m="http://schemas.openxmlformats.org/officeDocument/2006/math" xmlns:v="urn:schemas-microsoft-com:vml" xmlns:wp14="http://schemas.microsoft.com/office/word/2010/wordprocessingDrawing" xmlns:wp="http://schemas.openxmlformats.org/drawingml/2006/wordprocessingDrawing" xmlns:w10="urn:schemas-microsoft-com:office:word" xmlns:w="http://schemas.openxmlformats.org/wordprocessingml/2006/main" xmlns:w14="http://schemas.microsoft.com/office/word/2010/wordml" xmlns:w15="http://schemas.microsoft.com/office/word/2012/wordml" xmlns:w16cex="http://schemas.microsoft.com/office/word/2018/wordml/cex" xmlns:w16cid="http://schemas.microsoft.com/office/word/2016/wordml/cid" xmlns:w16="http://schemas.microsoft.com/office/word/2018/wordml" xmlns:w16du="http://schemas.microsoft.com/office/word/2023/wordml/word16du" xmlns:w16sdtdh="http://schemas.microsoft.com/office/word/2020/wordml/sdtdatahash" xmlns:w16se="http://schemas.microsoft.com/office/word/2015/wordml/symex" xmlns:wpg="http://schemas.microsoft.com/office/word/2010/wordprocessingGroup" xmlns:wpi="http://schemas.microsoft.com/office/word/2010/wordprocessingInk" xmlns:wne="http://schemas.microsoft.com/office/word/2006/wordml" xmlns:wps="http://schemas.microsoft.com/office/word/2010/wordprocessingShape" mc:Ignorable="w14 w15 w16se w16cid w16 w16cex w16sdtdh w16du wp14">
+<w:hdr xmlns:wpc="http://schemas.microsoft.com/office/word/2010/wordprocessingCanvas" xmlns:cx="http://schemas.microsoft.com/office/drawing/2014/chartex" xmlns:cx1="http://schemas.microsoft.com/office/drawing/2015/9/8/chartex" xmlns:cx2="http://schemas.microsoft.com/office/drawing/2015/10/21/chartex" xmlns:cx3="http://schemas.microsoft.com/office/drawing/2016/5/9/chartex" xmlns:cx4="http://schemas.microsoft.com/office/drawing/2016/5/10/chartex" xmlns:cx5="http://schemas.microsoft.com/office/drawing/2016/5/11/chartex" xmlns:cx6="http://schemas.microsoft.com/office/drawing/2016/5/12/chartex" xmlns:cx7="http://schemas.microsoft.com/office/drawing/2016/5/13/chartex" xmlns:cx8="http://schemas.microsoft.com/office/drawing/2016/5/14/chartex" xmlns:mc="http://schemas.openxmlformats.org/markup-compatibility/2006" xmlns:aink="http://schemas.microsoft.com/office/drawing/2016/ink" xmlns:am3d="http://schemas.microsoft.com/office/drawing/2017/model3d" xmlns:o="urn:schemas-microsoft-com:office:office" xmlns:oel="http://schemas.microsoft.com/office/2019/extlst" xmlns:r="http://schemas.openxmlformats.org/officeDocument/2006/relationships" xmlns:m="http://schemas.openxmlformats.org/officeDocument/2006/math" xmlns:v="urn:schemas-microsoft-com:vml" xmlns:wp14="http://schemas.microsoft.com/office/word/2010/wordprocessingDrawing" xmlns:wp="http://schemas.openxmlformats.org/drawingml/2006/wordprocessingDrawing" xmlns:w10="urn:schemas-microsoft-com:office:word" xmlns:w="http://schemas.openxmlformats.org/wordprocessingml/2006/main" xmlns:w14="http://schemas.microsoft.com/office/word/2010/wordml" xmlns:w15="http://schemas.microsoft.com/office/word/2012/wordml" xmlns:w16cex="http://schemas.microsoft.com/office/word/2018/wordml/cex" xmlns:w16cid="http://schemas.microsoft.com/office/word/2016/wordml/cid" xmlns:w16="http://schemas.microsoft.com/office/word/2018/wordml" xmlns:w16du="http://schemas.microsoft.com/office/word/2023/wordml/word16du" xmlns:w16sdtdh="http://schemas.microsoft.com/office/word/2020/wordml/sdtdatahash" xmlns:w16sdtfl="http://schemas.microsoft.com/office/word/2024/wordml/sdtformatlock" xmlns:w16se="http://schemas.microsoft.com/office/word/2015/wordml/symex" xmlns:wpg="http://schemas.microsoft.com/office/word/2010/wordprocessingGroup" xmlns:wpi="http://schemas.microsoft.com/office/word/2010/wordprocessingInk" xmlns:wne="http://schemas.microsoft.com/office/word/2006/wordml" xmlns:wps="http://schemas.microsoft.com/office/word/2010/wordprocessingShape" mc:Ignorable="w14 w15 w16se w16cid w16 w16cex w16sdtdh w16sdtfl w16du wp14">
+  <w:p>
+    <w:pPr>
+      <w:pStyle w:val="Encabezado"/>
+    </w:pPr>
+  </w:p>
+</w:hdr>
+</file>
+
+<file path=word/header2.xml><?xml version="1.0" encoding="utf-8"?>
+<w:hdr xmlns:wpc="http://schemas.microsoft.com/office/word/2010/wordprocessingCanvas" xmlns:cx="http://schemas.microsoft.com/office/drawing/2014/chartex" xmlns:cx1="http://schemas.microsoft.com/office/drawing/2015/9/8/chartex" xmlns:cx2="http://schemas.microsoft.com/office/drawing/2015/10/21/chartex" xmlns:cx3="http://schemas.microsoft.com/office/drawing/2016/5/9/chartex" xmlns:cx4="http://schemas.microsoft.com/office/drawing/2016/5/10/chartex" xmlns:cx5="http://schemas.microsoft.com/office/drawing/2016/5/11/chartex" xmlns:cx6="http://schemas.microsoft.com/office/drawing/2016/5/12/chartex" xmlns:cx7="http://schemas.microsoft.com/office/drawing/2016/5/13/chartex" xmlns:cx8="http://schemas.microsoft.com/office/drawing/2016/5/14/chartex" xmlns:mc="http://schemas.openxmlformats.org/markup-compatibility/2006" xmlns:aink="http://schemas.microsoft.com/office/drawing/2016/ink" xmlns:am3d="http://schemas.microsoft.com/office/drawing/2017/model3d" xmlns:o="urn:schemas-microsoft-com:office:office" xmlns:oel="http://schemas.microsoft.com/office/2019/extlst" xmlns:r="http://schemas.openxmlformats.org/officeDocument/2006/relationships" xmlns:m="http://schemas.openxmlformats.org/officeDocument/2006/math" xmlns:v="urn:schemas-microsoft-com:vml" xmlns:wp14="http://schemas.microsoft.com/office/word/2010/wordprocessingDrawing" xmlns:wp="http://schemas.openxmlformats.org/drawingml/2006/wordprocessingDrawing" xmlns:w10="urn:schemas-microsoft-com:office:word" xmlns:w="http://schemas.openxmlformats.org/wordprocessingml/2006/main" xmlns:w14="http://schemas.microsoft.com/office/word/2010/wordml" xmlns:w15="http://schemas.microsoft.com/office/word/2012/wordml" xmlns:w16cex="http://schemas.microsoft.com/office/word/2018/wordml/cex" xmlns:w16cid="http://schemas.microsoft.com/office/word/2016/wordml/cid" xmlns:w16="http://schemas.microsoft.com/office/word/2018/wordml" xmlns:w16du="http://schemas.microsoft.com/office/word/2023/wordml/word16du" xmlns:w16sdtdh="http://schemas.microsoft.com/office/word/2020/wordml/sdtdatahash" xmlns:w16sdtfl="http://schemas.microsoft.com/office/word/2024/wordml/sdtformatlock" xmlns:w16se="http://schemas.microsoft.com/office/word/2015/wordml/symex" xmlns:wpg="http://schemas.microsoft.com/office/word/2010/wordprocessingGroup" xmlns:wpi="http://schemas.microsoft.com/office/word/2010/wordprocessingInk" xmlns:wne="http://schemas.microsoft.com/office/word/2006/wordml" xmlns:wps="http://schemas.microsoft.com/office/word/2010/wordprocessingShape" mc:Ignorable="w14 w15 w16se w16cid w16 w16cex w16sdtdh w16sdtfl w16du wp14">
   <w:tbl>
     <w:tblPr>
       <w:tblStyle w:val="Tablaconcuadrcula"/>
@@ -2377,6 +2410,7 @@
           <w:pPr>
             <w:pStyle w:val="Encabezado"/>
             <w:tabs>
+              <w:tab w:val="center" w:pos="4003"/>
               <w:tab w:val="right" w:pos="7371"/>
             </w:tabs>
             <w:ind w:right="-111"/>
@@ -2393,7 +2427,79 @@
               <w:bCs/>
               <w:noProof/>
             </w:rPr>
-            <w:t>{{ razon_social }}</w:t>
+            <w:t>{{ Nombre</w:t>
+          </w:r>
+          <w:r>
+            <w:rPr>
+              <w:b/>
+              <w:bCs/>
+              <w:noProof/>
+            </w:rPr>
+            <w:t>_</w:t>
+          </w:r>
+          <w:r>
+            <w:rPr>
+              <w:b/>
+              <w:bCs/>
+              <w:noProof/>
+            </w:rPr>
+            <w:t>Comercial }}</w:t>
+          </w:r>
+        </w:p>
+        <w:p>
+          <w:pPr>
+            <w:pStyle w:val="Encabezado"/>
+            <w:tabs>
+              <w:tab w:val="center" w:pos="4003"/>
+              <w:tab w:val="right" w:pos="7371"/>
+            </w:tabs>
+            <w:ind w:right="-111"/>
+            <w:jc w:val="center"/>
+            <w:rPr>
+              <w:b/>
+              <w:bCs/>
+              <w:noProof/>
+            </w:rPr>
+          </w:pPr>
+          <w:r>
+            <w:rPr>
+              <w:b/>
+              <w:bCs/>
+              <w:noProof/>
+            </w:rPr>
+            <w:t>{{ Raz</w:t>
+          </w:r>
+          <w:r>
+            <w:rPr>
+              <w:b/>
+              <w:bCs/>
+              <w:noProof/>
+            </w:rPr>
+            <w:t>o</w:t>
+          </w:r>
+          <w:r>
+            <w:rPr>
+              <w:b/>
+              <w:bCs/>
+              <w:noProof/>
+            </w:rPr>
+            <w:t>n</w:t>
+          </w:r>
+          <w:r>
+            <w:rPr>
+              <w:b/>
+              <w:bCs/>
+              <w:noProof/>
+            </w:rPr>
+            <w:t>_</w:t>
+          </w:r>
+          <w:r>
+            <w:rPr>
+              <w:b/>
+              <w:bCs/>
+              <w:noProof/>
+            </w:rPr>
+            <w:t>Social }}</w:t>
           </w:r>
         </w:p>
         <w:p>
@@ -2415,7 +2521,7 @@
               <w:bCs/>
               <w:noProof/>
             </w:rPr>
-            <w:t>{{ nombre_comercial }}</w:t>
+            <w:t>{{ RFC }}</w:t>
           </w:r>
         </w:p>
       </w:tc>
@@ -2453,8 +2559,8 @@
 </w:hdr>
 </file>
 
-<file path=word/header2.xml><?xml version="1.0" encoding="utf-8"?>
-<w:hdr xmlns:wpc="http://schemas.microsoft.com/office/word/2010/wordprocessingCanvas" xmlns:cx="http://schemas.microsoft.com/office/drawing/2014/chartex" xmlns:cx1="http://schemas.microsoft.com/office/drawing/2015/9/8/chartex" xmlns:cx2="http://schemas.microsoft.com/office/drawing/2015/10/21/chartex" xmlns:cx3="http://schemas.microsoft.com/office/drawing/2016/5/9/chartex" xmlns:cx4="http://schemas.microsoft.com/office/drawing/2016/5/10/chartex" xmlns:cx5="http://schemas.microsoft.com/office/drawing/2016/5/11/chartex" xmlns:cx6="http://schemas.microsoft.com/office/drawing/2016/5/12/chartex" xmlns:cx7="http://schemas.microsoft.com/office/drawing/2016/5/13/chartex" xmlns:cx8="http://schemas.microsoft.com/office/drawing/2016/5/14/chartex" xmlns:mc="http://schemas.openxmlformats.org/markup-compatibility/2006" xmlns:aink="http://schemas.microsoft.com/office/drawing/2016/ink" xmlns:am3d="http://schemas.microsoft.com/office/drawing/2017/model3d" xmlns:o="urn:schemas-microsoft-com:office:office" xmlns:oel="http://schemas.microsoft.com/office/2019/extlst" xmlns:r="http://schemas.openxmlformats.org/officeDocument/2006/relationships" xmlns:m="http://schemas.openxmlformats.org/officeDocument/2006/math" xmlns:v="urn:schemas-microsoft-com:vml" xmlns:wp14="http://schemas.microsoft.com/office/word/2010/wordprocessingDrawing" xmlns:wp="http://schemas.openxmlformats.org/drawingml/2006/wordprocessingDrawing" xmlns:w10="urn:schemas-microsoft-com:office:word" xmlns:w="http://schemas.openxmlformats.org/wordprocessingml/2006/main" xmlns:w14="http://schemas.microsoft.com/office/word/2010/wordml" xmlns:w15="http://schemas.microsoft.com/office/word/2012/wordml" xmlns:w16cex="http://schemas.microsoft.com/office/word/2018/wordml/cex" xmlns:w16cid="http://schemas.microsoft.com/office/word/2016/wordml/cid" xmlns:w16="http://schemas.microsoft.com/office/word/2018/wordml" xmlns:w16du="http://schemas.microsoft.com/office/word/2023/wordml/word16du" xmlns:w16sdtdh="http://schemas.microsoft.com/office/word/2020/wordml/sdtdatahash" xmlns:w16se="http://schemas.microsoft.com/office/word/2015/wordml/symex" xmlns:wpg="http://schemas.microsoft.com/office/word/2010/wordprocessingGroup" xmlns:wpi="http://schemas.microsoft.com/office/word/2010/wordprocessingInk" xmlns:wne="http://schemas.microsoft.com/office/word/2006/wordml" xmlns:wps="http://schemas.microsoft.com/office/word/2010/wordprocessingShape" mc:Ignorable="w14 w15 w16se w16cid w16 w16cex w16sdtdh w16du wp14">
+<file path=word/header3.xml><?xml version="1.0" encoding="utf-8"?>
+<w:hdr xmlns:wpc="http://schemas.microsoft.com/office/word/2010/wordprocessingCanvas" xmlns:cx="http://schemas.microsoft.com/office/drawing/2014/chartex" xmlns:cx1="http://schemas.microsoft.com/office/drawing/2015/9/8/chartex" xmlns:cx2="http://schemas.microsoft.com/office/drawing/2015/10/21/chartex" xmlns:cx3="http://schemas.microsoft.com/office/drawing/2016/5/9/chartex" xmlns:cx4="http://schemas.microsoft.com/office/drawing/2016/5/10/chartex" xmlns:cx5="http://schemas.microsoft.com/office/drawing/2016/5/11/chartex" xmlns:cx6="http://schemas.microsoft.com/office/drawing/2016/5/12/chartex" xmlns:cx7="http://schemas.microsoft.com/office/drawing/2016/5/13/chartex" xmlns:cx8="http://schemas.microsoft.com/office/drawing/2016/5/14/chartex" xmlns:mc="http://schemas.openxmlformats.org/markup-compatibility/2006" xmlns:aink="http://schemas.microsoft.com/office/drawing/2016/ink" xmlns:am3d="http://schemas.microsoft.com/office/drawing/2017/model3d" xmlns:o="urn:schemas-microsoft-com:office:office" xmlns:oel="http://schemas.microsoft.com/office/2019/extlst" xmlns:r="http://schemas.openxmlformats.org/officeDocument/2006/relationships" xmlns:m="http://schemas.openxmlformats.org/officeDocument/2006/math" xmlns:v="urn:schemas-microsoft-com:vml" xmlns:wp14="http://schemas.microsoft.com/office/word/2010/wordprocessingDrawing" xmlns:wp="http://schemas.openxmlformats.org/drawingml/2006/wordprocessingDrawing" xmlns:w10="urn:schemas-microsoft-com:office:word" xmlns:w="http://schemas.openxmlformats.org/wordprocessingml/2006/main" xmlns:w14="http://schemas.microsoft.com/office/word/2010/wordml" xmlns:w15="http://schemas.microsoft.com/office/word/2012/wordml" xmlns:w16cex="http://schemas.microsoft.com/office/word/2018/wordml/cex" xmlns:w16cid="http://schemas.microsoft.com/office/word/2016/wordml/cid" xmlns:w16="http://schemas.microsoft.com/office/word/2018/wordml" xmlns:w16du="http://schemas.microsoft.com/office/word/2023/wordml/word16du" xmlns:w16sdtdh="http://schemas.microsoft.com/office/word/2020/wordml/sdtdatahash" xmlns:w16sdtfl="http://schemas.microsoft.com/office/word/2024/wordml/sdtformatlock" xmlns:w16se="http://schemas.microsoft.com/office/word/2015/wordml/symex" xmlns:wpg="http://schemas.microsoft.com/office/word/2010/wordprocessingGroup" xmlns:wpi="http://schemas.microsoft.com/office/word/2010/wordprocessingInk" xmlns:wne="http://schemas.microsoft.com/office/word/2006/wordml" xmlns:wps="http://schemas.microsoft.com/office/word/2010/wordprocessingShape" mc:Ignorable="w14 w15 w16se w16cid w16 w16cex w16sdtdh w16sdtfl w16du wp14">
   <w:p>
     <w:pPr>
       <w:pStyle w:val="Encabezado"/>
@@ -2589,8 +2695,8 @@
 </w:hdr>
 </file>
 
-<file path=word/header3.xml><?xml version="1.0" encoding="utf-8"?>
-<w:hdr xmlns:wpc="http://schemas.microsoft.com/office/word/2010/wordprocessingCanvas" xmlns:cx="http://schemas.microsoft.com/office/drawing/2014/chartex" xmlns:cx1="http://schemas.microsoft.com/office/drawing/2015/9/8/chartex" xmlns:cx2="http://schemas.microsoft.com/office/drawing/2015/10/21/chartex" xmlns:cx3="http://schemas.microsoft.com/office/drawing/2016/5/9/chartex" xmlns:cx4="http://schemas.microsoft.com/office/drawing/2016/5/10/chartex" xmlns:cx5="http://schemas.microsoft.com/office/drawing/2016/5/11/chartex" xmlns:cx6="http://schemas.microsoft.com/office/drawing/2016/5/12/chartex" xmlns:cx7="http://schemas.microsoft.com/office/drawing/2016/5/13/chartex" xmlns:cx8="http://schemas.microsoft.com/office/drawing/2016/5/14/chartex" xmlns:mc="http://schemas.openxmlformats.org/markup-compatibility/2006" xmlns:aink="http://schemas.microsoft.com/office/drawing/2016/ink" xmlns:am3d="http://schemas.microsoft.com/office/drawing/2017/model3d" xmlns:o="urn:schemas-microsoft-com:office:office" xmlns:oel="http://schemas.microsoft.com/office/2019/extlst" xmlns:r="http://schemas.openxmlformats.org/officeDocument/2006/relationships" xmlns:m="http://schemas.openxmlformats.org/officeDocument/2006/math" xmlns:v="urn:schemas-microsoft-com:vml" xmlns:wp14="http://schemas.microsoft.com/office/word/2010/wordprocessingDrawing" xmlns:wp="http://schemas.openxmlformats.org/drawingml/2006/wordprocessingDrawing" xmlns:w10="urn:schemas-microsoft-com:office:word" xmlns:w="http://schemas.openxmlformats.org/wordprocessingml/2006/main" xmlns:w14="http://schemas.microsoft.com/office/word/2010/wordml" xmlns:w15="http://schemas.microsoft.com/office/word/2012/wordml" xmlns:w16cex="http://schemas.microsoft.com/office/word/2018/wordml/cex" xmlns:w16cid="http://schemas.microsoft.com/office/word/2016/wordml/cid" xmlns:w16="http://schemas.microsoft.com/office/word/2018/wordml" xmlns:w16du="http://schemas.microsoft.com/office/word/2023/wordml/word16du" xmlns:w16sdtdh="http://schemas.microsoft.com/office/word/2020/wordml/sdtdatahash" xmlns:w16se="http://schemas.microsoft.com/office/word/2015/wordml/symex" xmlns:wpg="http://schemas.microsoft.com/office/word/2010/wordprocessingGroup" xmlns:wpi="http://schemas.microsoft.com/office/word/2010/wordprocessingInk" xmlns:wne="http://schemas.microsoft.com/office/word/2006/wordml" xmlns:wps="http://schemas.microsoft.com/office/word/2010/wordprocessingShape" mc:Ignorable="w14 w15 w16se w16cid w16 w16cex w16sdtdh w16du wp14">
+<file path=word/header4.xml><?xml version="1.0" encoding="utf-8"?>
+<w:hdr xmlns:wpc="http://schemas.microsoft.com/office/word/2010/wordprocessingCanvas" xmlns:cx="http://schemas.microsoft.com/office/drawing/2014/chartex" xmlns:cx1="http://schemas.microsoft.com/office/drawing/2015/9/8/chartex" xmlns:cx2="http://schemas.microsoft.com/office/drawing/2015/10/21/chartex" xmlns:cx3="http://schemas.microsoft.com/office/drawing/2016/5/9/chartex" xmlns:cx4="http://schemas.microsoft.com/office/drawing/2016/5/10/chartex" xmlns:cx5="http://schemas.microsoft.com/office/drawing/2016/5/11/chartex" xmlns:cx6="http://schemas.microsoft.com/office/drawing/2016/5/12/chartex" xmlns:cx7="http://schemas.microsoft.com/office/drawing/2016/5/13/chartex" xmlns:cx8="http://schemas.microsoft.com/office/drawing/2016/5/14/chartex" xmlns:mc="http://schemas.openxmlformats.org/markup-compatibility/2006" xmlns:aink="http://schemas.microsoft.com/office/drawing/2016/ink" xmlns:am3d="http://schemas.microsoft.com/office/drawing/2017/model3d" xmlns:o="urn:schemas-microsoft-com:office:office" xmlns:oel="http://schemas.microsoft.com/office/2019/extlst" xmlns:r="http://schemas.openxmlformats.org/officeDocument/2006/relationships" xmlns:m="http://schemas.openxmlformats.org/officeDocument/2006/math" xmlns:v="urn:schemas-microsoft-com:vml" xmlns:wp14="http://schemas.microsoft.com/office/word/2010/wordprocessingDrawing" xmlns:wp="http://schemas.openxmlformats.org/drawingml/2006/wordprocessingDrawing" xmlns:w10="urn:schemas-microsoft-com:office:word" xmlns:w="http://schemas.openxmlformats.org/wordprocessingml/2006/main" xmlns:w14="http://schemas.microsoft.com/office/word/2010/wordml" xmlns:w15="http://schemas.microsoft.com/office/word/2012/wordml" xmlns:w16cex="http://schemas.microsoft.com/office/word/2018/wordml/cex" xmlns:w16cid="http://schemas.microsoft.com/office/word/2016/wordml/cid" xmlns:w16="http://schemas.microsoft.com/office/word/2018/wordml" xmlns:w16du="http://schemas.microsoft.com/office/word/2023/wordml/word16du" xmlns:w16sdtdh="http://schemas.microsoft.com/office/word/2020/wordml/sdtdatahash" xmlns:w16sdtfl="http://schemas.microsoft.com/office/word/2024/wordml/sdtformatlock" xmlns:w16se="http://schemas.microsoft.com/office/word/2015/wordml/symex" xmlns:wpg="http://schemas.microsoft.com/office/word/2010/wordprocessingGroup" xmlns:wpi="http://schemas.microsoft.com/office/word/2010/wordprocessingInk" xmlns:wne="http://schemas.microsoft.com/office/word/2006/wordml" xmlns:wps="http://schemas.microsoft.com/office/word/2010/wordprocessingShape" mc:Ignorable="w14 w15 w16se w16cid w16 w16cex w16sdtdh w16sdtfl w16du wp14">
   <w:p>
     <w:pPr>
       <w:pStyle w:val="Encabezado"/>
@@ -2724,8 +2830,8 @@
 </w:hdr>
 </file>
 
-<file path=word/header4.xml><?xml version="1.0" encoding="utf-8"?>
-<w:hdr xmlns:wpc="http://schemas.microsoft.com/office/word/2010/wordprocessingCanvas" xmlns:cx="http://schemas.microsoft.com/office/drawing/2014/chartex" xmlns:cx1="http://schemas.microsoft.com/office/drawing/2015/9/8/chartex" xmlns:cx2="http://schemas.microsoft.com/office/drawing/2015/10/21/chartex" xmlns:cx3="http://schemas.microsoft.com/office/drawing/2016/5/9/chartex" xmlns:cx4="http://schemas.microsoft.com/office/drawing/2016/5/10/chartex" xmlns:cx5="http://schemas.microsoft.com/office/drawing/2016/5/11/chartex" xmlns:cx6="http://schemas.microsoft.com/office/drawing/2016/5/12/chartex" xmlns:cx7="http://schemas.microsoft.com/office/drawing/2016/5/13/chartex" xmlns:cx8="http://schemas.microsoft.com/office/drawing/2016/5/14/chartex" xmlns:mc="http://schemas.openxmlformats.org/markup-compatibility/2006" xmlns:aink="http://schemas.microsoft.com/office/drawing/2016/ink" xmlns:am3d="http://schemas.microsoft.com/office/drawing/2017/model3d" xmlns:o="urn:schemas-microsoft-com:office:office" xmlns:oel="http://schemas.microsoft.com/office/2019/extlst" xmlns:r="http://schemas.openxmlformats.org/officeDocument/2006/relationships" xmlns:m="http://schemas.openxmlformats.org/officeDocument/2006/math" xmlns:v="urn:schemas-microsoft-com:vml" xmlns:wp14="http://schemas.microsoft.com/office/word/2010/wordprocessingDrawing" xmlns:wp="http://schemas.openxmlformats.org/drawingml/2006/wordprocessingDrawing" xmlns:w10="urn:schemas-microsoft-com:office:word" xmlns:w="http://schemas.openxmlformats.org/wordprocessingml/2006/main" xmlns:w14="http://schemas.microsoft.com/office/word/2010/wordml" xmlns:w15="http://schemas.microsoft.com/office/word/2012/wordml" xmlns:w16cex="http://schemas.microsoft.com/office/word/2018/wordml/cex" xmlns:w16cid="http://schemas.microsoft.com/office/word/2016/wordml/cid" xmlns:w16="http://schemas.microsoft.com/office/word/2018/wordml" xmlns:w16du="http://schemas.microsoft.com/office/word/2023/wordml/word16du" xmlns:w16sdtdh="http://schemas.microsoft.com/office/word/2020/wordml/sdtdatahash" xmlns:w16se="http://schemas.microsoft.com/office/word/2015/wordml/symex" xmlns:wpg="http://schemas.microsoft.com/office/word/2010/wordprocessingGroup" xmlns:wpi="http://schemas.microsoft.com/office/word/2010/wordprocessingInk" xmlns:wne="http://schemas.microsoft.com/office/word/2006/wordml" xmlns:wps="http://schemas.microsoft.com/office/word/2010/wordprocessingShape" mc:Ignorable="w14 w15 w16se w16cid w16 w16cex w16sdtdh w16du wp14">
+<file path=word/header5.xml><?xml version="1.0" encoding="utf-8"?>
+<w:hdr xmlns:wpc="http://schemas.microsoft.com/office/word/2010/wordprocessingCanvas" xmlns:cx="http://schemas.microsoft.com/office/drawing/2014/chartex" xmlns:cx1="http://schemas.microsoft.com/office/drawing/2015/9/8/chartex" xmlns:cx2="http://schemas.microsoft.com/office/drawing/2015/10/21/chartex" xmlns:cx3="http://schemas.microsoft.com/office/drawing/2016/5/9/chartex" xmlns:cx4="http://schemas.microsoft.com/office/drawing/2016/5/10/chartex" xmlns:cx5="http://schemas.microsoft.com/office/drawing/2016/5/11/chartex" xmlns:cx6="http://schemas.microsoft.com/office/drawing/2016/5/12/chartex" xmlns:cx7="http://schemas.microsoft.com/office/drawing/2016/5/13/chartex" xmlns:cx8="http://schemas.microsoft.com/office/drawing/2016/5/14/chartex" xmlns:mc="http://schemas.openxmlformats.org/markup-compatibility/2006" xmlns:aink="http://schemas.microsoft.com/office/drawing/2016/ink" xmlns:am3d="http://schemas.microsoft.com/office/drawing/2017/model3d" xmlns:o="urn:schemas-microsoft-com:office:office" xmlns:oel="http://schemas.microsoft.com/office/2019/extlst" xmlns:r="http://schemas.openxmlformats.org/officeDocument/2006/relationships" xmlns:m="http://schemas.openxmlformats.org/officeDocument/2006/math" xmlns:v="urn:schemas-microsoft-com:vml" xmlns:wp14="http://schemas.microsoft.com/office/word/2010/wordprocessingDrawing" xmlns:wp="http://schemas.openxmlformats.org/drawingml/2006/wordprocessingDrawing" xmlns:w10="urn:schemas-microsoft-com:office:word" xmlns:w="http://schemas.openxmlformats.org/wordprocessingml/2006/main" xmlns:w14="http://schemas.microsoft.com/office/word/2010/wordml" xmlns:w15="http://schemas.microsoft.com/office/word/2012/wordml" xmlns:w16cex="http://schemas.microsoft.com/office/word/2018/wordml/cex" xmlns:w16cid="http://schemas.microsoft.com/office/word/2016/wordml/cid" xmlns:w16="http://schemas.microsoft.com/office/word/2018/wordml" xmlns:w16du="http://schemas.microsoft.com/office/word/2023/wordml/word16du" xmlns:w16sdtdh="http://schemas.microsoft.com/office/word/2020/wordml/sdtdatahash" xmlns:w16sdtfl="http://schemas.microsoft.com/office/word/2024/wordml/sdtformatlock" xmlns:w16se="http://schemas.microsoft.com/office/word/2015/wordml/symex" xmlns:wpg="http://schemas.microsoft.com/office/word/2010/wordprocessingGroup" xmlns:wpi="http://schemas.microsoft.com/office/word/2010/wordprocessingInk" xmlns:wne="http://schemas.microsoft.com/office/word/2006/wordml" xmlns:wps="http://schemas.microsoft.com/office/word/2010/wordprocessingShape" mc:Ignorable="w14 w15 w16se w16cid w16 w16cex w16sdtdh w16sdtfl w16du wp14">
   <w:p>
     <w:pPr>
       <w:pStyle w:val="Encabezado"/>
@@ -2861,7 +2967,7 @@
 </file>
 
 <file path=word/numbering.xml><?xml version="1.0" encoding="utf-8"?>
-<w:numbering xmlns:wpc="http://schemas.microsoft.com/office/word/2010/wordprocessingCanvas" xmlns:cx="http://schemas.microsoft.com/office/drawing/2014/chartex" xmlns:cx1="http://schemas.microsoft.com/office/drawing/2015/9/8/chartex" xmlns:cx2="http://schemas.microsoft.com/office/drawing/2015/10/21/chartex" xmlns:cx3="http://schemas.microsoft.com/office/drawing/2016/5/9/chartex" xmlns:cx4="http://schemas.microsoft.com/office/drawing/2016/5/10/chartex" xmlns:cx5="http://schemas.microsoft.com/office/drawing/2016/5/11/chartex" xmlns:cx6="http://schemas.microsoft.com/office/drawing/2016/5/12/chartex" xmlns:cx7="http://schemas.microsoft.com/office/drawing/2016/5/13/chartex" xmlns:cx8="http://schemas.microsoft.com/office/drawing/2016/5/14/chartex" xmlns:mc="http://schemas.openxmlformats.org/markup-compatibility/2006" xmlns:aink="http://schemas.microsoft.com/office/drawing/2016/ink" xmlns:am3d="http://schemas.microsoft.com/office/drawing/2017/model3d" xmlns:o="urn:schemas-microsoft-com:office:office" xmlns:oel="http://schemas.microsoft.com/office/2019/extlst" xmlns:r="http://schemas.openxmlformats.org/officeDocument/2006/relationships" xmlns:m="http://schemas.openxmlformats.org/officeDocument/2006/math" xmlns:v="urn:schemas-microsoft-com:vml" xmlns:wp14="http://schemas.microsoft.com/office/word/2010/wordprocessingDrawing" xmlns:wp="http://schemas.openxmlformats.org/drawingml/2006/wordprocessingDrawing" xmlns:w10="urn:schemas-microsoft-com:office:word" xmlns:w="http://schemas.openxmlformats.org/wordprocessingml/2006/main" xmlns:w14="http://schemas.microsoft.com/office/word/2010/wordml" xmlns:w15="http://schemas.microsoft.com/office/word/2012/wordml" xmlns:w16cex="http://schemas.microsoft.com/office/word/2018/wordml/cex" xmlns:w16cid="http://schemas.microsoft.com/office/word/2016/wordml/cid" xmlns:w16="http://schemas.microsoft.com/office/word/2018/wordml" xmlns:w16du="http://schemas.microsoft.com/office/word/2023/wordml/word16du" xmlns:w16sdtdh="http://schemas.microsoft.com/office/word/2020/wordml/sdtdatahash" xmlns:w16se="http://schemas.microsoft.com/office/word/2015/wordml/symex" xmlns:wpg="http://schemas.microsoft.com/office/word/2010/wordprocessingGroup" xmlns:wpi="http://schemas.microsoft.com/office/word/2010/wordprocessingInk" xmlns:wne="http://schemas.microsoft.com/office/word/2006/wordml" xmlns:wps="http://schemas.microsoft.com/office/word/2010/wordprocessingShape" mc:Ignorable="w14 w15 w16se w16cid w16 w16cex w16sdtdh w16du wp14">
+<w:numbering xmlns:wpc="http://schemas.microsoft.com/office/word/2010/wordprocessingCanvas" xmlns:cx="http://schemas.microsoft.com/office/drawing/2014/chartex" xmlns:cx1="http://schemas.microsoft.com/office/drawing/2015/9/8/chartex" xmlns:cx2="http://schemas.microsoft.com/office/drawing/2015/10/21/chartex" xmlns:cx3="http://schemas.microsoft.com/office/drawing/2016/5/9/chartex" xmlns:cx4="http://schemas.microsoft.com/office/drawing/2016/5/10/chartex" xmlns:cx5="http://schemas.microsoft.com/office/drawing/2016/5/11/chartex" xmlns:cx6="http://schemas.microsoft.com/office/drawing/2016/5/12/chartex" xmlns:cx7="http://schemas.microsoft.com/office/drawing/2016/5/13/chartex" xmlns:cx8="http://schemas.microsoft.com/office/drawing/2016/5/14/chartex" xmlns:mc="http://schemas.openxmlformats.org/markup-compatibility/2006" xmlns:aink="http://schemas.microsoft.com/office/drawing/2016/ink" xmlns:am3d="http://schemas.microsoft.com/office/drawing/2017/model3d" xmlns:o="urn:schemas-microsoft-com:office:office" xmlns:oel="http://schemas.microsoft.com/office/2019/extlst" xmlns:r="http://schemas.openxmlformats.org/officeDocument/2006/relationships" xmlns:m="http://schemas.openxmlformats.org/officeDocument/2006/math" xmlns:v="urn:schemas-microsoft-com:vml" xmlns:wp14="http://schemas.microsoft.com/office/word/2010/wordprocessingDrawing" xmlns:wp="http://schemas.openxmlformats.org/drawingml/2006/wordprocessingDrawing" xmlns:w10="urn:schemas-microsoft-com:office:word" xmlns:w="http://schemas.openxmlformats.org/wordprocessingml/2006/main" xmlns:w14="http://schemas.microsoft.com/office/word/2010/wordml" xmlns:w15="http://schemas.microsoft.com/office/word/2012/wordml" xmlns:w16cex="http://schemas.microsoft.com/office/word/2018/wordml/cex" xmlns:w16cid="http://schemas.microsoft.com/office/word/2016/wordml/cid" xmlns:w16="http://schemas.microsoft.com/office/word/2018/wordml" xmlns:w16du="http://schemas.microsoft.com/office/word/2023/wordml/word16du" xmlns:w16sdtdh="http://schemas.microsoft.com/office/word/2020/wordml/sdtdatahash" xmlns:w16sdtfl="http://schemas.microsoft.com/office/word/2024/wordml/sdtformatlock" xmlns:w16se="http://schemas.microsoft.com/office/word/2015/wordml/symex" xmlns:wpg="http://schemas.microsoft.com/office/word/2010/wordprocessingGroup" xmlns:wpi="http://schemas.microsoft.com/office/word/2010/wordprocessingInk" xmlns:wne="http://schemas.microsoft.com/office/word/2006/wordml" xmlns:wps="http://schemas.microsoft.com/office/word/2010/wordprocessingShape" mc:Ignorable="w14 w15 w16se w16cid w16 w16cex w16sdtdh w16sdtfl w16du wp14">
   <w:abstractNum w:abstractNumId="0" w15:restartNumberingAfterBreak="1">
     <w:nsid w:val="FFFFFF89"/>
     <w:multiLevelType w:val="singleLevel"/>
@@ -2891,7 +2997,7 @@
 </file>
 
 <file path=word/styles.xml><?xml version="1.0" encoding="utf-8"?>
-<w:styles xmlns:mc="http://schemas.openxmlformats.org/markup-compatibility/2006" xmlns:r="http://schemas.openxmlformats.org/officeDocument/2006/relationships" xmlns:w="http://schemas.openxmlformats.org/wordprocessingml/2006/main" xmlns:w14="http://schemas.microsoft.com/office/word/2010/wordml" xmlns:w15="http://schemas.microsoft.com/office/word/2012/wordml" xmlns:w16cex="http://schemas.microsoft.com/office/word/2018/wordml/cex" xmlns:w16cid="http://schemas.microsoft.com/office/word/2016/wordml/cid" xmlns:w16="http://schemas.microsoft.com/office/word/2018/wordml" xmlns:w16du="http://schemas.microsoft.com/office/word/2023/wordml/word16du" xmlns:w16sdtdh="http://schemas.microsoft.com/office/word/2020/wordml/sdtdatahash" xmlns:w16se="http://schemas.microsoft.com/office/word/2015/wordml/symex" mc:Ignorable="w14 w15 w16se w16cid w16 w16cex w16sdtdh w16du">
+<w:styles xmlns:mc="http://schemas.openxmlformats.org/markup-compatibility/2006" xmlns:r="http://schemas.openxmlformats.org/officeDocument/2006/relationships" xmlns:w="http://schemas.openxmlformats.org/wordprocessingml/2006/main" xmlns:w14="http://schemas.microsoft.com/office/word/2010/wordml" xmlns:w15="http://schemas.microsoft.com/office/word/2012/wordml" xmlns:w16cex="http://schemas.microsoft.com/office/word/2018/wordml/cex" xmlns:w16cid="http://schemas.microsoft.com/office/word/2016/wordml/cid" xmlns:w16="http://schemas.microsoft.com/office/word/2018/wordml" xmlns:w16du="http://schemas.microsoft.com/office/word/2023/wordml/word16du" xmlns:w16sdtdh="http://schemas.microsoft.com/office/word/2020/wordml/sdtdatahash" xmlns:w16sdtfl="http://schemas.microsoft.com/office/word/2024/wordml/sdtformatlock" xmlns:w16se="http://schemas.microsoft.com/office/word/2015/wordml/symex" mc:Ignorable="w14 w15 w16se w16cid w16 w16cex w16sdtdh w16sdtfl w16du">
   <w:docDefaults>
     <w:rPrDefault>
       <w:rPr>

</xml_diff>